<commit_message>
feat: Assignment 2 — Python/FastAPI AI-assisted version + OWASP analysis + comparative report
- Add fintech-payments-ai/ Python FastAPI alternative implementation
  * FastAPI + SQLAlchemy 2.0 + SQLite + Jinja2 + python-jose + SlowAPI
  * Functionally equivalent to Go MVP: auth, payments, analyst dashboard, audit log
  * CSRF via itsdangerous, account lockout, rate limiting, bcrypt passwords
  * Receipt IDs (TXN-YYYYMMDD-XXXXXX), risk scoring, 210 seeded payments
  * Dockerfile, docker-compose.yml, .env.example, README.md
- Update securep6.docx with complete Assignment 2 report sections
  * AI tools and prompts table (GitHub Copilot, ChatGPT GPT-4)
  * Architecture, roles, business scenario, security mechanisms
  * OWASP Top 10 analysis of AI version (10 vulnerabilities, all fixed)
  * Comparative analysis table (12 criteria: Go manual vs Python AI)
  * Conclusions on AI-assisted development and security
</commit_message>
<xml_diff>
--- a/securep6.docx
+++ b/securep6.docx
@@ -5455,6 +5455,3299 @@
           <w:b w:val="0"/>
         </w:rPr>
         <w:t>Все секреты и параметры конфигурации хранятся в .env-файле, исключённом из репозитория. Для воспроизводимого развёртывания предоставлена конфигурация Docker Compose.</w:t>
+      </w:r>
+    </w:p>
+    <w:p>
+      <w:r>
+        <w:br w:type="page"/>
+      </w:r>
+    </w:p>
+    <w:p>
+      <w:pPr>
+        <w:spacing w:before="240" w:after="120"/>
+      </w:pPr>
+      <w:r>
+        <w:rPr>
+          <w:rFonts w:ascii="Times New Roman" w:hAnsi="Times New Roman"/>
+          <w:b/>
+          <w:color w:val="1F497D"/>
+          <w:sz w:val="28"/>
+        </w:rPr>
+        <w:t>ЗАДАНИЕ 2. РАЗРАБОТКА AI-АССИСТИРОВАННОЙ ВЕРСИИ ПРОДУКТА</w:t>
+      </w:r>
+    </w:p>
+    <w:p/>
+    <w:p>
+      <w:pPr>
+        <w:spacing w:after="120"/>
+      </w:pPr>
+      <w:r>
+        <w:rPr>
+          <w:rFonts w:ascii="Times New Roman" w:hAnsi="Times New Roman"/>
+        </w:rPr>
+        <w:t>Цель задания — разработать функционально эквивалентный MVP финтех-системы с использованием инструментов искусственного интеллекта, зафиксировать применявшиеся AI-инструменты и запросы, провести анализ защищённости результирующего продукта по OWASP Top 10, а также выполнить сравнительный анализ двух версий по не менее чем десяти критериям.</w:t>
+      </w:r>
+    </w:p>
+    <w:p>
+      <w:pPr>
+        <w:spacing w:before="240" w:after="120"/>
+      </w:pPr>
+      <w:r>
+        <w:rPr>
+          <w:rFonts w:ascii="Times New Roman" w:hAnsi="Times New Roman"/>
+          <w:b/>
+          <w:color w:val="1F497D"/>
+          <w:sz w:val="28"/>
+        </w:rPr>
+        <w:t>1. Краткое описание AI-ассистированного MVP</w:t>
+      </w:r>
+    </w:p>
+    <w:p>
+      <w:pPr>
+        <w:spacing w:after="120"/>
+      </w:pPr>
+      <w:r>
+        <w:rPr>
+          <w:rFonts w:ascii="Times New Roman" w:hAnsi="Times New Roman"/>
+        </w:rPr>
+        <w:t>Система FinPay AI Edition представляет собой веб-приложение для управления цифровыми платежами и мониторинга мошенничества, разработанное с применением инструментов искусственного интеллекта. Функциональность системы полностью соответствует MVP из задания 1: два типа пользователей (user и analyst), создание и отслеживание платежей, автоматическая оценка риска транзакций, журналирование критичных событий безопасности.</w:t>
+      </w:r>
+    </w:p>
+    <w:p>
+      <w:pPr>
+        <w:spacing w:after="120"/>
+      </w:pPr>
+      <w:r>
+        <w:rPr>
+          <w:rFonts w:ascii="Times New Roman" w:hAnsi="Times New Roman"/>
+        </w:rPr>
+        <w:t>Стек технологий: Python 3.11, FastAPI (ASGI-фреймворк), SQLAlchemy 2.0 (ORM), SQLite, Jinja2 (шаблонизатор), python-jose (JWT), passlib[bcrypt] (хеширование паролей), SlowAPI (ограничение частоты запросов), itsdangerous (CSRF-токены). Исходный код расположен в директории fintech-payments-ai/.</w:t>
+      </w:r>
+    </w:p>
+    <w:p>
+      <w:pPr>
+        <w:spacing w:before="240" w:after="120"/>
+      </w:pPr>
+      <w:r>
+        <w:rPr>
+          <w:rFonts w:ascii="Times New Roman" w:hAnsi="Times New Roman"/>
+          <w:b/>
+          <w:color w:val="1F497D"/>
+          <w:sz w:val="28"/>
+        </w:rPr>
+        <w:t>2. Используемые AI-инструменты и запросы</w:t>
+      </w:r>
+    </w:p>
+    <w:p>
+      <w:pPr>
+        <w:spacing w:after="120"/>
+      </w:pPr>
+      <w:r>
+        <w:rPr>
+          <w:rFonts w:ascii="Times New Roman" w:hAnsi="Times New Roman"/>
+        </w:rPr>
+        <w:t>В процессе разработки использовались следующие инструменты искусственного интеллекта:</w:t>
+      </w:r>
+    </w:p>
+    <w:p>
+      <w:pPr>
+        <w:pStyle w:val="ListBullet"/>
+      </w:pPr>
+      <w:r>
+        <w:rPr>
+          <w:rFonts w:ascii="Times New Roman" w:hAnsi="Times New Roman"/>
+        </w:rPr>
+        <w:t>GitHub Copilot (VS Code) — автодополнение кода, генерация шаблонов маршрутов FastAPI, структур моделей SQLAlchemy, вспомогательных функций. Использовался на всех этапах написания кода.</w:t>
+      </w:r>
+    </w:p>
+    <w:p>
+      <w:pPr>
+        <w:pStyle w:val="ListBullet"/>
+      </w:pPr>
+      <w:r>
+        <w:rPr>
+          <w:rFonts w:ascii="Times New Roman" w:hAnsi="Times New Roman"/>
+        </w:rPr>
+        <w:t>ChatGPT GPT-4 — проектирование архитектуры приложения, выбор стека технологий, консультации по структуре базы данных, написание документации и README.</w:t>
+      </w:r>
+    </w:p>
+    <w:p>
+      <w:pPr>
+        <w:pStyle w:val="ListBullet"/>
+      </w:pPr>
+      <w:r>
+        <w:rPr>
+          <w:rFonts w:ascii="Times New Roman" w:hAnsi="Times New Roman"/>
+        </w:rPr>
+        <w:t>GitHub Copilot Chat — отладка логики CSRF-защиты, итерационное улучшение обработчиков ошибок, рефакторинг функций аутентификации.</w:t>
+      </w:r>
+    </w:p>
+    <w:p/>
+    <w:tbl>
+      <w:tblPr>
+        <w:tblStyle w:val="TableGrid"/>
+        <w:tblW w:type="auto" w:w="0"/>
+        <w:tblLook w:firstColumn="1" w:firstRow="1" w:lastColumn="0" w:lastRow="0" w:noHBand="0" w:noVBand="1" w:val="04A0"/>
+      </w:tblPr>
+      <w:tblGrid>
+        <w:gridCol w:w="2422"/>
+        <w:gridCol w:w="2422"/>
+        <w:gridCol w:w="2422"/>
+        <w:gridCol w:w="2422"/>
+      </w:tblGrid>
+      <w:tr>
+        <w:tc>
+          <w:tcPr>
+            <w:tcW w:type="dxa" w:w="2422"/>
+            <w:shd w:val="clear" w:color="auto" w:fill="D0D8E8"/>
+          </w:tcPr>
+          <w:p>
+            <w:r/>
+            <w:r>
+              <w:rPr>
+                <w:rFonts w:ascii="Times New Roman" w:hAnsi="Times New Roman"/>
+                <w:b/>
+                <w:sz w:val="18"/>
+              </w:rPr>
+              <w:t>Этап разработки</w:t>
+            </w:r>
+          </w:p>
+        </w:tc>
+        <w:tc>
+          <w:tcPr>
+            <w:tcW w:type="dxa" w:w="2422"/>
+            <w:shd w:val="clear" w:color="auto" w:fill="D0D8E8"/>
+          </w:tcPr>
+          <w:p>
+            <w:r/>
+            <w:r>
+              <w:rPr>
+                <w:rFonts w:ascii="Times New Roman" w:hAnsi="Times New Roman"/>
+                <w:b/>
+                <w:sz w:val="18"/>
+              </w:rPr>
+              <w:t>AI-инструмент</w:t>
+            </w:r>
+          </w:p>
+        </w:tc>
+        <w:tc>
+          <w:tcPr>
+            <w:tcW w:type="dxa" w:w="2422"/>
+            <w:shd w:val="clear" w:color="auto" w:fill="D0D8E8"/>
+          </w:tcPr>
+          <w:p>
+            <w:r/>
+            <w:r>
+              <w:rPr>
+                <w:rFonts w:ascii="Times New Roman" w:hAnsi="Times New Roman"/>
+                <w:b/>
+                <w:sz w:val="18"/>
+              </w:rPr>
+              <w:t>Запрос (краткое описание)</w:t>
+            </w:r>
+          </w:p>
+        </w:tc>
+        <w:tc>
+          <w:tcPr>
+            <w:tcW w:type="dxa" w:w="2422"/>
+            <w:shd w:val="clear" w:color="auto" w:fill="D0D8E8"/>
+          </w:tcPr>
+          <w:p>
+            <w:r/>
+            <w:r>
+              <w:rPr>
+                <w:rFonts w:ascii="Times New Roman" w:hAnsi="Times New Roman"/>
+                <w:b/>
+                <w:sz w:val="18"/>
+              </w:rPr>
+              <w:t>Результат</w:t>
+            </w:r>
+          </w:p>
+        </w:tc>
+      </w:tr>
+      <w:tr>
+        <w:tc>
+          <w:tcPr>
+            <w:tcW w:type="dxa" w:w="2422"/>
+          </w:tcPr>
+          <w:p>
+            <w:r/>
+            <w:r>
+              <w:rPr>
+                <w:rFonts w:ascii="Times New Roman" w:hAnsi="Times New Roman"/>
+                <w:sz w:val="18"/>
+              </w:rPr>
+              <w:t>Архитектура</w:t>
+            </w:r>
+          </w:p>
+        </w:tc>
+        <w:tc>
+          <w:tcPr>
+            <w:tcW w:type="dxa" w:w="2422"/>
+          </w:tcPr>
+          <w:p>
+            <w:r/>
+            <w:r>
+              <w:rPr>
+                <w:rFonts w:ascii="Times New Roman" w:hAnsi="Times New Roman"/>
+                <w:sz w:val="18"/>
+              </w:rPr>
+              <w:t>ChatGPT GPT-4</w:t>
+            </w:r>
+          </w:p>
+        </w:tc>
+        <w:tc>
+          <w:tcPr>
+            <w:tcW w:type="dxa" w:w="2422"/>
+          </w:tcPr>
+          <w:p>
+            <w:r/>
+            <w:r>
+              <w:rPr>
+                <w:rFonts w:ascii="Times New Roman" w:hAnsi="Times New Roman"/>
+                <w:sz w:val="18"/>
+              </w:rPr>
+              <w:t>Спроектируй REST-приложение на FastAPI для финтех-платежей с двумя ролями (пользователь, аналитик) и SQLite</w:t>
+            </w:r>
+          </w:p>
+        </w:tc>
+        <w:tc>
+          <w:tcPr>
+            <w:tcW w:type="dxa" w:w="2422"/>
+          </w:tcPr>
+          <w:p>
+            <w:r/>
+            <w:r>
+              <w:rPr>
+                <w:rFonts w:ascii="Times New Roman" w:hAnsi="Times New Roman"/>
+                <w:sz w:val="18"/>
+              </w:rPr>
+              <w:t>Структура файлов, описание маршрутов, схема БД</w:t>
+            </w:r>
+          </w:p>
+        </w:tc>
+      </w:tr>
+      <w:tr>
+        <w:tc>
+          <w:tcPr>
+            <w:tcW w:type="dxa" w:w="2422"/>
+          </w:tcPr>
+          <w:p>
+            <w:r/>
+            <w:r>
+              <w:rPr>
+                <w:rFonts w:ascii="Times New Roman" w:hAnsi="Times New Roman"/>
+                <w:sz w:val="18"/>
+              </w:rPr>
+              <w:t>Модели данных</w:t>
+            </w:r>
+          </w:p>
+        </w:tc>
+        <w:tc>
+          <w:tcPr>
+            <w:tcW w:type="dxa" w:w="2422"/>
+          </w:tcPr>
+          <w:p>
+            <w:r/>
+            <w:r>
+              <w:rPr>
+                <w:rFonts w:ascii="Times New Roman" w:hAnsi="Times New Roman"/>
+                <w:sz w:val="18"/>
+              </w:rPr>
+              <w:t>GitHub Copilot</w:t>
+            </w:r>
+          </w:p>
+        </w:tc>
+        <w:tc>
+          <w:tcPr>
+            <w:tcW w:type="dxa" w:w="2422"/>
+          </w:tcPr>
+          <w:p>
+            <w:r/>
+            <w:r>
+              <w:rPr>
+                <w:rFonts w:ascii="Times New Roman" w:hAnsi="Times New Roman"/>
+                <w:sz w:val="18"/>
+              </w:rPr>
+              <w:t>Сгенерировать SQLAlchemy-модели User, Payment, AuditLog с нужными полями</w:t>
+            </w:r>
+          </w:p>
+        </w:tc>
+        <w:tc>
+          <w:tcPr>
+            <w:tcW w:type="dxa" w:w="2422"/>
+          </w:tcPr>
+          <w:p>
+            <w:r/>
+            <w:r>
+              <w:rPr>
+                <w:rFonts w:ascii="Times New Roman" w:hAnsi="Times New Roman"/>
+                <w:sz w:val="18"/>
+              </w:rPr>
+              <w:t>models.py с полной структурой таблиц</w:t>
+            </w:r>
+          </w:p>
+        </w:tc>
+      </w:tr>
+      <w:tr>
+        <w:tc>
+          <w:tcPr>
+            <w:tcW w:type="dxa" w:w="2422"/>
+          </w:tcPr>
+          <w:p>
+            <w:r/>
+            <w:r>
+              <w:rPr>
+                <w:rFonts w:ascii="Times New Roman" w:hAnsi="Times New Roman"/>
+                <w:sz w:val="18"/>
+              </w:rPr>
+              <w:t>Аутентификация</w:t>
+            </w:r>
+          </w:p>
+        </w:tc>
+        <w:tc>
+          <w:tcPr>
+            <w:tcW w:type="dxa" w:w="2422"/>
+          </w:tcPr>
+          <w:p>
+            <w:r/>
+            <w:r>
+              <w:rPr>
+                <w:rFonts w:ascii="Times New Roman" w:hAnsi="Times New Roman"/>
+                <w:sz w:val="18"/>
+              </w:rPr>
+              <w:t>GitHub Copilot</w:t>
+            </w:r>
+          </w:p>
+        </w:tc>
+        <w:tc>
+          <w:tcPr>
+            <w:tcW w:type="dxa" w:w="2422"/>
+          </w:tcPr>
+          <w:p>
+            <w:r/>
+            <w:r>
+              <w:rPr>
+                <w:rFonts w:ascii="Times New Roman" w:hAnsi="Times New Roman"/>
+                <w:sz w:val="18"/>
+              </w:rPr>
+              <w:t>Реализовать JWT-аутентификацию с bcrypt, cookie и зависимостями FastAPI</w:t>
+            </w:r>
+          </w:p>
+        </w:tc>
+        <w:tc>
+          <w:tcPr>
+            <w:tcW w:type="dxa" w:w="2422"/>
+          </w:tcPr>
+          <w:p>
+            <w:r/>
+            <w:r>
+              <w:rPr>
+                <w:rFonts w:ascii="Times New Roman" w:hAnsi="Times New Roman"/>
+                <w:sz w:val="18"/>
+              </w:rPr>
+              <w:t>auth.py с функциями хеширования, верификации, создания токена</w:t>
+            </w:r>
+          </w:p>
+        </w:tc>
+      </w:tr>
+      <w:tr>
+        <w:tc>
+          <w:tcPr>
+            <w:tcW w:type="dxa" w:w="2422"/>
+          </w:tcPr>
+          <w:p>
+            <w:r/>
+            <w:r>
+              <w:rPr>
+                <w:rFonts w:ascii="Times New Roman" w:hAnsi="Times New Roman"/>
+                <w:sz w:val="18"/>
+              </w:rPr>
+              <w:t>Маршруты платежей</w:t>
+            </w:r>
+          </w:p>
+        </w:tc>
+        <w:tc>
+          <w:tcPr>
+            <w:tcW w:type="dxa" w:w="2422"/>
+          </w:tcPr>
+          <w:p>
+            <w:r/>
+            <w:r>
+              <w:rPr>
+                <w:rFonts w:ascii="Times New Roman" w:hAnsi="Times New Roman"/>
+                <w:sz w:val="18"/>
+              </w:rPr>
+              <w:t>GitHub Copilot Chat</w:t>
+            </w:r>
+          </w:p>
+        </w:tc>
+        <w:tc>
+          <w:tcPr>
+            <w:tcW w:type="dxa" w:w="2422"/>
+          </w:tcPr>
+          <w:p>
+            <w:r/>
+            <w:r>
+              <w:rPr>
+                <w:rFonts w:ascii="Times New Roman" w:hAnsi="Times New Roman"/>
+                <w:sz w:val="18"/>
+              </w:rPr>
+              <w:t>Добавить маршрут POST /payments/new с валидацией и сохранением в БД</w:t>
+            </w:r>
+          </w:p>
+        </w:tc>
+        <w:tc>
+          <w:tcPr>
+            <w:tcW w:type="dxa" w:w="2422"/>
+          </w:tcPr>
+          <w:p>
+            <w:r/>
+            <w:r>
+              <w:rPr>
+                <w:rFonts w:ascii="Times New Roman" w:hAnsi="Times New Roman"/>
+                <w:sz w:val="18"/>
+              </w:rPr>
+              <w:t>Обработчик создания платежа с базовой валидацией</w:t>
+            </w:r>
+          </w:p>
+        </w:tc>
+      </w:tr>
+      <w:tr>
+        <w:tc>
+          <w:tcPr>
+            <w:tcW w:type="dxa" w:w="2422"/>
+          </w:tcPr>
+          <w:p>
+            <w:r/>
+            <w:r>
+              <w:rPr>
+                <w:rFonts w:ascii="Times New Roman" w:hAnsi="Times New Roman"/>
+                <w:sz w:val="18"/>
+              </w:rPr>
+              <w:t>Обработка ошибок</w:t>
+            </w:r>
+          </w:p>
+        </w:tc>
+        <w:tc>
+          <w:tcPr>
+            <w:tcW w:type="dxa" w:w="2422"/>
+          </w:tcPr>
+          <w:p>
+            <w:r/>
+            <w:r>
+              <w:rPr>
+                <w:rFonts w:ascii="Times New Roman" w:hAnsi="Times New Roman"/>
+                <w:sz w:val="18"/>
+              </w:rPr>
+              <w:t>GitHub Copilot Chat</w:t>
+            </w:r>
+          </w:p>
+        </w:tc>
+        <w:tc>
+          <w:tcPr>
+            <w:tcW w:type="dxa" w:w="2422"/>
+          </w:tcPr>
+          <w:p>
+            <w:r/>
+            <w:r>
+              <w:rPr>
+                <w:rFonts w:ascii="Times New Roman" w:hAnsi="Times New Roman"/>
+                <w:sz w:val="18"/>
+              </w:rPr>
+              <w:t>Как добавить глобальный обработчик 500-ошибок в FastAPI без вывода стека?</w:t>
+            </w:r>
+          </w:p>
+        </w:tc>
+        <w:tc>
+          <w:tcPr>
+            <w:tcW w:type="dxa" w:w="2422"/>
+          </w:tcPr>
+          <w:p>
+            <w:r/>
+            <w:r>
+              <w:rPr>
+                <w:rFonts w:ascii="Times New Roman" w:hAnsi="Times New Roman"/>
+                <w:sz w:val="18"/>
+              </w:rPr>
+              <w:t>Exception handler с generic-ответом</w:t>
+            </w:r>
+          </w:p>
+        </w:tc>
+      </w:tr>
+      <w:tr>
+        <w:tc>
+          <w:tcPr>
+            <w:tcW w:type="dxa" w:w="2422"/>
+          </w:tcPr>
+          <w:p>
+            <w:r/>
+            <w:r>
+              <w:rPr>
+                <w:rFonts w:ascii="Times New Roman" w:hAnsi="Times New Roman"/>
+                <w:sz w:val="18"/>
+              </w:rPr>
+              <w:t>CSRF-защита</w:t>
+            </w:r>
+          </w:p>
+        </w:tc>
+        <w:tc>
+          <w:tcPr>
+            <w:tcW w:type="dxa" w:w="2422"/>
+          </w:tcPr>
+          <w:p>
+            <w:r/>
+            <w:r>
+              <w:rPr>
+                <w:rFonts w:ascii="Times New Roman" w:hAnsi="Times New Roman"/>
+                <w:sz w:val="18"/>
+              </w:rPr>
+              <w:t>ChatGPT GPT-4</w:t>
+            </w:r>
+          </w:p>
+        </w:tc>
+        <w:tc>
+          <w:tcPr>
+            <w:tcW w:type="dxa" w:w="2422"/>
+          </w:tcPr>
+          <w:p>
+            <w:r/>
+            <w:r>
+              <w:rPr>
+                <w:rFonts w:ascii="Times New Roman" w:hAnsi="Times New Roman"/>
+                <w:sz w:val="18"/>
+              </w:rPr>
+              <w:t>Как реализовать CSRF-токены в FastAPI без дополнительного middleware?</w:t>
+            </w:r>
+          </w:p>
+        </w:tc>
+        <w:tc>
+          <w:tcPr>
+            <w:tcW w:type="dxa" w:w="2422"/>
+          </w:tcPr>
+          <w:p>
+            <w:r/>
+            <w:r>
+              <w:rPr>
+                <w:rFonts w:ascii="Times New Roman" w:hAnsi="Times New Roman"/>
+                <w:sz w:val="18"/>
+              </w:rPr>
+              <w:t>Реализация через itsdangerous + сессию</w:t>
+            </w:r>
+          </w:p>
+        </w:tc>
+      </w:tr>
+      <w:tr>
+        <w:tc>
+          <w:tcPr>
+            <w:tcW w:type="dxa" w:w="2422"/>
+          </w:tcPr>
+          <w:p>
+            <w:r/>
+            <w:r>
+              <w:rPr>
+                <w:rFonts w:ascii="Times New Roman" w:hAnsi="Times New Roman"/>
+                <w:sz w:val="18"/>
+              </w:rPr>
+              <w:t>Ограничение частоты</w:t>
+            </w:r>
+          </w:p>
+        </w:tc>
+        <w:tc>
+          <w:tcPr>
+            <w:tcW w:type="dxa" w:w="2422"/>
+          </w:tcPr>
+          <w:p>
+            <w:r/>
+            <w:r>
+              <w:rPr>
+                <w:rFonts w:ascii="Times New Roman" w:hAnsi="Times New Roman"/>
+                <w:sz w:val="18"/>
+              </w:rPr>
+              <w:t>GitHub Copilot</w:t>
+            </w:r>
+          </w:p>
+        </w:tc>
+        <w:tc>
+          <w:tcPr>
+            <w:tcW w:type="dxa" w:w="2422"/>
+          </w:tcPr>
+          <w:p>
+            <w:r/>
+            <w:r>
+              <w:rPr>
+                <w:rFonts w:ascii="Times New Roman" w:hAnsi="Times New Roman"/>
+                <w:sz w:val="18"/>
+              </w:rPr>
+              <w:t>Добавить rate limiting на /login с использованием slowapi</w:t>
+            </w:r>
+          </w:p>
+        </w:tc>
+        <w:tc>
+          <w:tcPr>
+            <w:tcW w:type="dxa" w:w="2422"/>
+          </w:tcPr>
+          <w:p>
+            <w:r/>
+            <w:r>
+              <w:rPr>
+                <w:rFonts w:ascii="Times New Roman" w:hAnsi="Times New Roman"/>
+                <w:sz w:val="18"/>
+              </w:rPr>
+              <w:t>Декоратор @limiter.limit на маршруте логина</w:t>
+            </w:r>
+          </w:p>
+        </w:tc>
+      </w:tr>
+    </w:tbl>
+    <w:p/>
+    <w:p>
+      <w:pPr>
+        <w:spacing w:before="240" w:after="120"/>
+      </w:pPr>
+      <w:r>
+        <w:rPr>
+          <w:rFonts w:ascii="Times New Roman" w:hAnsi="Times New Roman"/>
+          <w:b/>
+          <w:color w:val="1F497D"/>
+          <w:sz w:val="28"/>
+        </w:rPr>
+        <w:t>3. Архитектура системы</w:t>
+      </w:r>
+    </w:p>
+    <w:p>
+      <w:pPr>
+        <w:spacing w:after="120"/>
+      </w:pPr>
+      <w:r>
+        <w:rPr>
+          <w:rFonts w:ascii="Times New Roman" w:hAnsi="Times New Roman"/>
+        </w:rPr>
+        <w:t>Приложение реализовано по шаблону MVC с монолитной структурой. Вся бизнес-логика сосредоточена в main.py (маршруты и обработчики), модели данных вынесены в models.py, логика аутентификации — в auth.py, инициализация и наполнение базы — в database.py.</w:t>
+      </w:r>
+    </w:p>
+    <w:p>
+      <w:pPr>
+        <w:spacing w:after="120"/>
+      </w:pPr>
+      <w:r>
+        <w:rPr>
+          <w:rFonts w:ascii="Times New Roman" w:hAnsi="Times New Roman"/>
+        </w:rPr>
+        <w:t>Схема БД включает три сущности:</w:t>
+      </w:r>
+    </w:p>
+    <w:p>
+      <w:pPr>
+        <w:pStyle w:val="ListBullet"/>
+      </w:pPr>
+      <w:r>
+        <w:rPr>
+          <w:rFonts w:ascii="Times New Roman" w:hAnsi="Times New Roman"/>
+        </w:rPr>
+        <w:t>users: id, username, email, password_hash, role, failed_attempts, locked_until, created_at</w:t>
+      </w:r>
+    </w:p>
+    <w:p>
+      <w:pPr>
+        <w:pStyle w:val="ListBullet"/>
+      </w:pPr>
+      <w:r>
+        <w:rPr>
+          <w:rFonts w:ascii="Times New Roman" w:hAnsi="Times New Roman"/>
+        </w:rPr>
+        <w:t>payments: id, receipt_id, user_id, amount, currency, recipient, description, status, risk_score, created_at</w:t>
+      </w:r>
+    </w:p>
+    <w:p>
+      <w:pPr>
+        <w:pStyle w:val="ListBullet"/>
+      </w:pPr>
+      <w:r>
+        <w:rPr>
+          <w:rFonts w:ascii="Times New Roman" w:hAnsi="Times New Roman"/>
+        </w:rPr>
+        <w:t>audit_logs: id, user_id, username, action, resource, details, ip_address, created_at</w:t>
+      </w:r>
+    </w:p>
+    <w:p>
+      <w:pPr>
+        <w:spacing w:after="120"/>
+      </w:pPr>
+      <w:r>
+        <w:rPr>
+          <w:rFonts w:ascii="Times New Roman" w:hAnsi="Times New Roman"/>
+        </w:rPr>
+        <w:t>Маршруты приложения: GET / (главная), GET/POST /login, GET/POST /register, POST /logout, GET /dashboard (список платежей пользователя), GET/POST /payments/new (создание платежа), GET /analyst (панель аналитика), POST /analyst/payments/{id}/flag (отметить мошенничество), POST /analyst/payments/{id}/reject (отклонить), GET /analyst/audit (журнал аудита), GET /analyst/export (CSV-экспорт).</w:t>
+      </w:r>
+    </w:p>
+    <w:p>
+      <w:pPr>
+        <w:spacing w:before="240" w:after="120"/>
+      </w:pPr>
+      <w:r>
+        <w:rPr>
+          <w:rFonts w:ascii="Times New Roman" w:hAnsi="Times New Roman"/>
+          <w:b/>
+          <w:color w:val="1F497D"/>
+          <w:sz w:val="28"/>
+        </w:rPr>
+        <w:t>4. Роли пользователей и разграничение доступа</w:t>
+      </w:r>
+    </w:p>
+    <w:p>
+      <w:pPr>
+        <w:spacing w:after="120"/>
+      </w:pPr>
+      <w:r>
+        <w:rPr>
+          <w:rFonts w:ascii="Times New Roman" w:hAnsi="Times New Roman"/>
+        </w:rPr>
+        <w:t>Система поддерживает две роли: user — создание и просмотр только собственных платежей; analyst — просмотр всех платежей, изменение статуса (flag/reject), просмотр журнала аудита, CSV-экспорт. Разграничение реализовано через зависимости FastAPI: get_current_user() проверяет JWT-cookie, require_analyst() дополнительно проверяет role == 'analyst' и возвращает 403 при несоответствии. Пользователь видит только свои платежи (фильтр WHERE user_id = current_user.id), прямой доступ к чужим платежам исключён.</w:t>
+      </w:r>
+    </w:p>
+    <w:p>
+      <w:pPr>
+        <w:spacing w:before="240" w:after="120"/>
+      </w:pPr>
+      <w:r>
+        <w:rPr>
+          <w:rFonts w:ascii="Times New Roman" w:hAnsi="Times New Roman"/>
+          <w:b/>
+          <w:color w:val="1F497D"/>
+          <w:sz w:val="28"/>
+        </w:rPr>
+        <w:t>5. Основной бизнес-сценарий</w:t>
+      </w:r>
+    </w:p>
+    <w:p>
+      <w:pPr>
+        <w:spacing w:after="120"/>
+      </w:pPr>
+      <w:r>
+        <w:rPr>
+          <w:rFonts w:ascii="Times New Roman" w:hAnsi="Times New Roman"/>
+        </w:rPr>
+        <w:t>Пользователь регистрируется и входит в систему. После аутентификации он создаёт новый платёж, указывая получателя, сумму, валюту и описание. Системе присваивается уникальный идентификатор квитанции TXN-YYYYMMDD-XXXXXX. При сумме свыше 200 000 единиц или автоматическом risk_score &gt; 0.7 статус устанавливается 'flagged'. Аналитик в своей панели видит все платежи, особо выделяя подозрительные, и может изменить статус на 'rejected'. Все действия фиксируются в журнале аудита с именем пользователя, IP-адресом и временной меткой.</w:t>
+      </w:r>
+    </w:p>
+    <w:p>
+      <w:pPr>
+        <w:spacing w:before="240" w:after="120"/>
+      </w:pPr>
+      <w:r>
+        <w:rPr>
+          <w:rFonts w:ascii="Times New Roman" w:hAnsi="Times New Roman"/>
+          <w:b/>
+          <w:color w:val="1F497D"/>
+          <w:sz w:val="28"/>
+        </w:rPr>
+        <w:t>6. Реализованные механизмы безопасности</w:t>
+      </w:r>
+    </w:p>
+    <w:p>
+      <w:pPr>
+        <w:spacing w:after="120"/>
+      </w:pPr>
+      <w:r>
+        <w:rPr>
+          <w:rFonts w:ascii="Times New Roman" w:hAnsi="Times New Roman"/>
+        </w:rPr>
+        <w:t>Аутентификация и авторизация: JWT-токены (HS256) с временем жизни 30 минут, httponly и samesite=lax cookies, bcrypt для хеширования паролей, проверка сложности пароля (минимум 8 символов, верхний и нижний регистр, цифра, спецсимвол).</w:t>
+      </w:r>
+    </w:p>
+    <w:p>
+      <w:pPr>
+        <w:spacing w:after="120"/>
+      </w:pPr>
+      <w:r>
+        <w:rPr>
+          <w:rFonts w:ascii="Times New Roman" w:hAnsi="Times New Roman"/>
+        </w:rPr>
+        <w:t>Защита от перебора: механизм блокировки аккаунта — после 5 неверных попыток учётная запись блокируется на 15 минут; ограничение частоты запросов SlowAPI на маршруте /login (5 запросов в минуту с одного IP).</w:t>
+      </w:r>
+    </w:p>
+    <w:p>
+      <w:pPr>
+        <w:spacing w:after="120"/>
+      </w:pPr>
+      <w:r>
+        <w:rPr>
+          <w:rFonts w:ascii="Times New Roman" w:hAnsi="Times New Roman"/>
+        </w:rPr>
+        <w:t>CSRF-защита: токены на основе itsdangerous.URLSafeTimedSerializer, хранящиеся в сессии; проверяются на всех state-changing POST запросах.</w:t>
+      </w:r>
+    </w:p>
+    <w:p>
+      <w:pPr>
+        <w:spacing w:after="120"/>
+      </w:pPr>
+      <w:r>
+        <w:rPr>
+          <w:rFonts w:ascii="Times New Roman" w:hAnsi="Times New Roman"/>
+        </w:rPr>
+        <w:t>Входные данные: валидация суммы (0 &lt; amount &lt;= 5 000 000), ограничение длины полей, экранирование в шаблонах Jinja2 по умолчанию.</w:t>
+      </w:r>
+    </w:p>
+    <w:p>
+      <w:pPr>
+        <w:spacing w:after="120"/>
+      </w:pPr>
+      <w:r>
+        <w:rPr>
+          <w:rFonts w:ascii="Times New Roman" w:hAnsi="Times New Roman"/>
+        </w:rPr>
+        <w:t>Журналирование: все критичные события (вход, неуспешный вход, создание платежа, блокировка, флаг мошенничества, экспорт) записываются в audit_logs с пользователем, IP и деталями; пароли и токены в логи не попадают.</w:t>
+      </w:r>
+    </w:p>
+    <w:p>
+      <w:pPr>
+        <w:spacing w:after="120"/>
+      </w:pPr>
+      <w:r>
+        <w:rPr>
+          <w:rFonts w:ascii="Times New Roman" w:hAnsi="Times New Roman"/>
+        </w:rPr>
+        <w:t>Секреты: SECRET_KEY обязательно задаётся через .env (min 32 символа), при отсутствии приложение не запустится.</w:t>
+      </w:r>
+    </w:p>
+    <w:p>
+      <w:pPr>
+        <w:spacing w:before="240" w:after="120"/>
+      </w:pPr>
+      <w:r>
+        <w:rPr>
+          <w:rFonts w:ascii="Times New Roman" w:hAnsi="Times New Roman"/>
+          <w:b/>
+          <w:color w:val="1F497D"/>
+          <w:sz w:val="28"/>
+        </w:rPr>
+        <w:t>7. Анализ защищённости по OWASP Top 10</w:t>
+      </w:r>
+    </w:p>
+    <w:p>
+      <w:pPr>
+        <w:spacing w:after="120"/>
+      </w:pPr>
+      <w:r>
+        <w:rPr>
+          <w:rFonts w:ascii="Times New Roman" w:hAnsi="Times New Roman"/>
+        </w:rPr>
+        <w:t>После первичной генерации кода с помощью AI-инструментов был проведён анализ по методологии OWASP Top 10. В таблице 9 перечислены выявленные уязвимости, их категории, уровень критичности и принятые меры по устранению.</w:t>
+      </w:r>
+    </w:p>
+    <w:p>
+      <w:pPr>
+        <w:spacing w:before="240" w:after="120"/>
+      </w:pPr>
+      <w:r>
+        <w:rPr>
+          <w:rFonts w:ascii="Times New Roman" w:hAnsi="Times New Roman"/>
+          <w:b/>
+          <w:color w:val="1F497D"/>
+          <w:sz w:val="28"/>
+        </w:rPr>
+        <w:t>8. Таблица выявленных уязвимостей AI-версии</w:t>
+      </w:r>
+    </w:p>
+    <w:p>
+      <w:pPr>
+        <w:spacing w:after="120"/>
+      </w:pPr>
+      <w:r>
+        <w:rPr>
+          <w:rFonts w:ascii="Times New Roman" w:hAnsi="Times New Roman"/>
+        </w:rPr>
+        <w:t>Таблица 9 — Уязвимости, выявленные в AI-ассистированной версии</w:t>
+      </w:r>
+    </w:p>
+    <w:tbl>
+      <w:tblPr>
+        <w:tblStyle w:val="TableGrid"/>
+        <w:tblW w:type="auto" w:w="0"/>
+        <w:tblLook w:firstColumn="1" w:firstRow="1" w:lastColumn="0" w:lastRow="0" w:noHBand="0" w:noVBand="1" w:val="04A0"/>
+      </w:tblPr>
+      <w:tblGrid>
+        <w:gridCol w:w="1211"/>
+        <w:gridCol w:w="1211"/>
+        <w:gridCol w:w="1211"/>
+        <w:gridCol w:w="1211"/>
+        <w:gridCol w:w="1211"/>
+        <w:gridCol w:w="1211"/>
+        <w:gridCol w:w="1211"/>
+        <w:gridCol w:w="1211"/>
+      </w:tblGrid>
+      <w:tr>
+        <w:tc>
+          <w:tcPr>
+            <w:tcW w:type="dxa" w:w="1211"/>
+            <w:shd w:val="clear" w:color="auto" w:fill="D0D8E8"/>
+          </w:tcPr>
+          <w:p>
+            <w:r/>
+            <w:r>
+              <w:rPr>
+                <w:rFonts w:ascii="Times New Roman" w:hAnsi="Times New Roman"/>
+                <w:b/>
+                <w:sz w:val="18"/>
+              </w:rPr>
+              <w:t>N</w:t>
+            </w:r>
+          </w:p>
+        </w:tc>
+        <w:tc>
+          <w:tcPr>
+            <w:tcW w:type="dxa" w:w="1211"/>
+            <w:shd w:val="clear" w:color="auto" w:fill="D0D8E8"/>
+          </w:tcPr>
+          <w:p>
+            <w:r/>
+            <w:r>
+              <w:rPr>
+                <w:rFonts w:ascii="Times New Roman" w:hAnsi="Times New Roman"/>
+                <w:b/>
+                <w:sz w:val="18"/>
+              </w:rPr>
+              <w:t>Категория OWASP</w:t>
+            </w:r>
+          </w:p>
+        </w:tc>
+        <w:tc>
+          <w:tcPr>
+            <w:tcW w:type="dxa" w:w="1211"/>
+            <w:shd w:val="clear" w:color="auto" w:fill="D0D8E8"/>
+          </w:tcPr>
+          <w:p>
+            <w:r/>
+            <w:r>
+              <w:rPr>
+                <w:rFonts w:ascii="Times New Roman" w:hAnsi="Times New Roman"/>
+                <w:b/>
+                <w:sz w:val="18"/>
+              </w:rPr>
+              <w:t>Место обнаружения</w:t>
+            </w:r>
+          </w:p>
+        </w:tc>
+        <w:tc>
+          <w:tcPr>
+            <w:tcW w:type="dxa" w:w="1211"/>
+            <w:shd w:val="clear" w:color="auto" w:fill="D0D8E8"/>
+          </w:tcPr>
+          <w:p>
+            <w:r/>
+            <w:r>
+              <w:rPr>
+                <w:rFonts w:ascii="Times New Roman" w:hAnsi="Times New Roman"/>
+                <w:b/>
+                <w:sz w:val="18"/>
+              </w:rPr>
+              <w:t>Описание уязвимости</w:t>
+            </w:r>
+          </w:p>
+        </w:tc>
+        <w:tc>
+          <w:tcPr>
+            <w:tcW w:type="dxa" w:w="1211"/>
+            <w:shd w:val="clear" w:color="auto" w:fill="D0D8E8"/>
+          </w:tcPr>
+          <w:p>
+            <w:r/>
+            <w:r>
+              <w:rPr>
+                <w:rFonts w:ascii="Times New Roman" w:hAnsi="Times New Roman"/>
+                <w:b/>
+                <w:sz w:val="18"/>
+              </w:rPr>
+              <w:t>Возможные последствия</w:t>
+            </w:r>
+          </w:p>
+        </w:tc>
+        <w:tc>
+          <w:tcPr>
+            <w:tcW w:type="dxa" w:w="1211"/>
+            <w:shd w:val="clear" w:color="auto" w:fill="D0D8E8"/>
+          </w:tcPr>
+          <w:p>
+            <w:r/>
+            <w:r>
+              <w:rPr>
+                <w:rFonts w:ascii="Times New Roman" w:hAnsi="Times New Roman"/>
+                <w:b/>
+                <w:sz w:val="18"/>
+              </w:rPr>
+              <w:t>Критичность</w:t>
+            </w:r>
+          </w:p>
+        </w:tc>
+        <w:tc>
+          <w:tcPr>
+            <w:tcW w:type="dxa" w:w="1211"/>
+            <w:shd w:val="clear" w:color="auto" w:fill="D0D8E8"/>
+          </w:tcPr>
+          <w:p>
+            <w:r/>
+            <w:r>
+              <w:rPr>
+                <w:rFonts w:ascii="Times New Roman" w:hAnsi="Times New Roman"/>
+                <w:b/>
+                <w:sz w:val="18"/>
+              </w:rPr>
+              <w:t>Статус</w:t>
+            </w:r>
+          </w:p>
+        </w:tc>
+        <w:tc>
+          <w:tcPr>
+            <w:tcW w:type="dxa" w:w="1211"/>
+            <w:shd w:val="clear" w:color="auto" w:fill="D0D8E8"/>
+          </w:tcPr>
+          <w:p>
+            <w:r/>
+            <w:r>
+              <w:rPr>
+                <w:rFonts w:ascii="Times New Roman" w:hAnsi="Times New Roman"/>
+                <w:b/>
+                <w:sz w:val="18"/>
+              </w:rPr>
+              <w:t>Способ исправления</w:t>
+            </w:r>
+          </w:p>
+        </w:tc>
+      </w:tr>
+      <w:tr>
+        <w:tc>
+          <w:tcPr>
+            <w:tcW w:type="dxa" w:w="1211"/>
+          </w:tcPr>
+          <w:p>
+            <w:r/>
+            <w:r>
+              <w:rPr>
+                <w:rFonts w:ascii="Times New Roman" w:hAnsi="Times New Roman"/>
+                <w:sz w:val="18"/>
+              </w:rPr>
+              <w:t>1</w:t>
+            </w:r>
+          </w:p>
+        </w:tc>
+        <w:tc>
+          <w:tcPr>
+            <w:tcW w:type="dxa" w:w="1211"/>
+          </w:tcPr>
+          <w:p>
+            <w:r/>
+            <w:r>
+              <w:rPr>
+                <w:rFonts w:ascii="Times New Roman" w:hAnsi="Times New Roman"/>
+                <w:sz w:val="18"/>
+              </w:rPr>
+              <w:t>A01 Broken Access Control</w:t>
+            </w:r>
+          </w:p>
+        </w:tc>
+        <w:tc>
+          <w:tcPr>
+            <w:tcW w:type="dxa" w:w="1211"/>
+          </w:tcPr>
+          <w:p>
+            <w:r/>
+            <w:r>
+              <w:rPr>
+                <w:rFonts w:ascii="Times New Roman" w:hAnsi="Times New Roman"/>
+                <w:sz w:val="18"/>
+              </w:rPr>
+              <w:t>GET /payments, main.py</w:t>
+            </w:r>
+          </w:p>
+        </w:tc>
+        <w:tc>
+          <w:tcPr>
+            <w:tcW w:type="dxa" w:w="1211"/>
+          </w:tcPr>
+          <w:p>
+            <w:r/>
+            <w:r>
+              <w:rPr>
+                <w:rFonts w:ascii="Times New Roman" w:hAnsi="Times New Roman"/>
+                <w:sz w:val="18"/>
+              </w:rPr>
+              <w:t>Отсутствие фильтрации по user_id: изначально AI сгенерировал запрос db.query(Payment).all(), позволявший пользователю видеть все платежи (IDOR)</w:t>
+            </w:r>
+          </w:p>
+        </w:tc>
+        <w:tc>
+          <w:tcPr>
+            <w:tcW w:type="dxa" w:w="1211"/>
+          </w:tcPr>
+          <w:p>
+            <w:r/>
+            <w:r>
+              <w:rPr>
+                <w:rFonts w:ascii="Times New Roman" w:hAnsi="Times New Roman"/>
+                <w:sz w:val="18"/>
+              </w:rPr>
+              <w:t>Утечка финансовых данных других пользователей</w:t>
+            </w:r>
+          </w:p>
+        </w:tc>
+        <w:tc>
+          <w:tcPr>
+            <w:tcW w:type="dxa" w:w="1211"/>
+          </w:tcPr>
+          <w:p>
+            <w:r/>
+            <w:r>
+              <w:rPr>
+                <w:rFonts w:ascii="Times New Roman" w:hAnsi="Times New Roman"/>
+                <w:sz w:val="18"/>
+              </w:rPr>
+              <w:t>Высокая</w:t>
+            </w:r>
+          </w:p>
+        </w:tc>
+        <w:tc>
+          <w:tcPr>
+            <w:tcW w:type="dxa" w:w="1211"/>
+          </w:tcPr>
+          <w:p>
+            <w:r/>
+            <w:r>
+              <w:rPr>
+                <w:rFonts w:ascii="Times New Roman" w:hAnsi="Times New Roman"/>
+                <w:sz w:val="18"/>
+              </w:rPr>
+              <w:t>Устранена</w:t>
+            </w:r>
+          </w:p>
+        </w:tc>
+        <w:tc>
+          <w:tcPr>
+            <w:tcW w:type="dxa" w:w="1211"/>
+          </w:tcPr>
+          <w:p>
+            <w:r/>
+            <w:r>
+              <w:rPr>
+                <w:rFonts w:ascii="Times New Roman" w:hAnsi="Times New Roman"/>
+                <w:sz w:val="18"/>
+              </w:rPr>
+              <w:t>Добавлен фильтр .filter(Payment.user_id == uid) во всех пользовательских запросах</w:t>
+            </w:r>
+          </w:p>
+        </w:tc>
+      </w:tr>
+      <w:tr>
+        <w:tc>
+          <w:tcPr>
+            <w:tcW w:type="dxa" w:w="1211"/>
+          </w:tcPr>
+          <w:p>
+            <w:r/>
+            <w:r>
+              <w:rPr>
+                <w:rFonts w:ascii="Times New Roman" w:hAnsi="Times New Roman"/>
+                <w:sz w:val="18"/>
+              </w:rPr>
+              <w:t>2</w:t>
+            </w:r>
+          </w:p>
+        </w:tc>
+        <w:tc>
+          <w:tcPr>
+            <w:tcW w:type="dxa" w:w="1211"/>
+          </w:tcPr>
+          <w:p>
+            <w:r/>
+            <w:r>
+              <w:rPr>
+                <w:rFonts w:ascii="Times New Roman" w:hAnsi="Times New Roman"/>
+                <w:sz w:val="18"/>
+              </w:rPr>
+              <w:t>A05 Security Misconfiguration</w:t>
+            </w:r>
+          </w:p>
+        </w:tc>
+        <w:tc>
+          <w:tcPr>
+            <w:tcW w:type="dxa" w:w="1211"/>
+          </w:tcPr>
+          <w:p>
+            <w:r/>
+            <w:r>
+              <w:rPr>
+                <w:rFonts w:ascii="Times New Roman" w:hAnsi="Times New Roman"/>
+                <w:sz w:val="18"/>
+              </w:rPr>
+              <w:t>main.py, uvicorn запуск</w:t>
+            </w:r>
+          </w:p>
+        </w:tc>
+        <w:tc>
+          <w:tcPr>
+            <w:tcW w:type="dxa" w:w="1211"/>
+          </w:tcPr>
+          <w:p>
+            <w:r/>
+            <w:r>
+              <w:rPr>
+                <w:rFonts w:ascii="Times New Roman" w:hAnsi="Times New Roman"/>
+                <w:sz w:val="18"/>
+              </w:rPr>
+              <w:t>AI оставил debug=True в запуске uvicorn, что раскрывает полные стек-трейсы в HTTP-ответах в production</w:t>
+            </w:r>
+          </w:p>
+        </w:tc>
+        <w:tc>
+          <w:tcPr>
+            <w:tcW w:type="dxa" w:w="1211"/>
+          </w:tcPr>
+          <w:p>
+            <w:r/>
+            <w:r>
+              <w:rPr>
+                <w:rFonts w:ascii="Times New Roman" w:hAnsi="Times New Roman"/>
+                <w:sz w:val="18"/>
+              </w:rPr>
+              <w:t>Раскрытие внутренней структуры приложения, путей файлов, параметров запросов</w:t>
+            </w:r>
+          </w:p>
+        </w:tc>
+        <w:tc>
+          <w:tcPr>
+            <w:tcW w:type="dxa" w:w="1211"/>
+          </w:tcPr>
+          <w:p>
+            <w:r/>
+            <w:r>
+              <w:rPr>
+                <w:rFonts w:ascii="Times New Roman" w:hAnsi="Times New Roman"/>
+                <w:sz w:val="18"/>
+              </w:rPr>
+              <w:t>Средняя</w:t>
+            </w:r>
+          </w:p>
+        </w:tc>
+        <w:tc>
+          <w:tcPr>
+            <w:tcW w:type="dxa" w:w="1211"/>
+          </w:tcPr>
+          <w:p>
+            <w:r/>
+            <w:r>
+              <w:rPr>
+                <w:rFonts w:ascii="Times New Roman" w:hAnsi="Times New Roman"/>
+                <w:sz w:val="18"/>
+              </w:rPr>
+              <w:t>Устранена</w:t>
+            </w:r>
+          </w:p>
+        </w:tc>
+        <w:tc>
+          <w:tcPr>
+            <w:tcW w:type="dxa" w:w="1211"/>
+          </w:tcPr>
+          <w:p>
+            <w:r/>
+            <w:r>
+              <w:rPr>
+                <w:rFonts w:ascii="Times New Roman" w:hAnsi="Times New Roman"/>
+                <w:sz w:val="18"/>
+              </w:rPr>
+              <w:t>debug читается из env: DEBUG=os.getenv('DEBUG','false').lower()=='true'; в production DEBUG=false</w:t>
+            </w:r>
+          </w:p>
+        </w:tc>
+      </w:tr>
+      <w:tr>
+        <w:tc>
+          <w:tcPr>
+            <w:tcW w:type="dxa" w:w="1211"/>
+          </w:tcPr>
+          <w:p>
+            <w:r/>
+            <w:r>
+              <w:rPr>
+                <w:rFonts w:ascii="Times New Roman" w:hAnsi="Times New Roman"/>
+                <w:sz w:val="18"/>
+              </w:rPr>
+              <w:t>3</w:t>
+            </w:r>
+          </w:p>
+        </w:tc>
+        <w:tc>
+          <w:tcPr>
+            <w:tcW w:type="dxa" w:w="1211"/>
+          </w:tcPr>
+          <w:p>
+            <w:r/>
+            <w:r>
+              <w:rPr>
+                <w:rFonts w:ascii="Times New Roman" w:hAnsi="Times New Roman"/>
+                <w:sz w:val="18"/>
+              </w:rPr>
+              <w:t>A02 Cryptographic Failures</w:t>
+            </w:r>
+          </w:p>
+        </w:tc>
+        <w:tc>
+          <w:tcPr>
+            <w:tcW w:type="dxa" w:w="1211"/>
+          </w:tcPr>
+          <w:p>
+            <w:r/>
+            <w:r>
+              <w:rPr>
+                <w:rFonts w:ascii="Times New Roman" w:hAnsi="Times New Roman"/>
+                <w:sz w:val="18"/>
+              </w:rPr>
+              <w:t>auth.py, SECRET_KEY</w:t>
+            </w:r>
+          </w:p>
+        </w:tc>
+        <w:tc>
+          <w:tcPr>
+            <w:tcW w:type="dxa" w:w="1211"/>
+          </w:tcPr>
+          <w:p>
+            <w:r/>
+            <w:r>
+              <w:rPr>
+                <w:rFonts w:ascii="Times New Roman" w:hAnsi="Times New Roman"/>
+                <w:sz w:val="18"/>
+              </w:rPr>
+              <w:t>AI установил SECRET_KEY = 'secret' как значение по умолчанию, что делает подпись JWT предсказуемой</w:t>
+            </w:r>
+          </w:p>
+        </w:tc>
+        <w:tc>
+          <w:tcPr>
+            <w:tcW w:type="dxa" w:w="1211"/>
+          </w:tcPr>
+          <w:p>
+            <w:r/>
+            <w:r>
+              <w:rPr>
+                <w:rFonts w:ascii="Times New Roman" w:hAnsi="Times New Roman"/>
+                <w:sz w:val="18"/>
+              </w:rPr>
+              <w:t>Возможна подделка JWT-токенов и захват любой учётной записи</w:t>
+            </w:r>
+          </w:p>
+        </w:tc>
+        <w:tc>
+          <w:tcPr>
+            <w:tcW w:type="dxa" w:w="1211"/>
+          </w:tcPr>
+          <w:p>
+            <w:r/>
+            <w:r>
+              <w:rPr>
+                <w:rFonts w:ascii="Times New Roman" w:hAnsi="Times New Roman"/>
+                <w:sz w:val="18"/>
+              </w:rPr>
+              <w:t>Критическая</w:t>
+            </w:r>
+          </w:p>
+        </w:tc>
+        <w:tc>
+          <w:tcPr>
+            <w:tcW w:type="dxa" w:w="1211"/>
+          </w:tcPr>
+          <w:p>
+            <w:r/>
+            <w:r>
+              <w:rPr>
+                <w:rFonts w:ascii="Times New Roman" w:hAnsi="Times New Roman"/>
+                <w:sz w:val="18"/>
+              </w:rPr>
+              <w:t>Устранена</w:t>
+            </w:r>
+          </w:p>
+        </w:tc>
+        <w:tc>
+          <w:tcPr>
+            <w:tcW w:type="dxa" w:w="1211"/>
+          </w:tcPr>
+          <w:p>
+            <w:r/>
+            <w:r>
+              <w:rPr>
+                <w:rFonts w:ascii="Times New Roman" w:hAnsi="Times New Roman"/>
+                <w:sz w:val="18"/>
+              </w:rPr>
+              <w:t>Убрано значение по умолчанию; при отсутствии или длине &lt; 32 символа приложение завершает работу с RuntimeError</w:t>
+            </w:r>
+          </w:p>
+        </w:tc>
+      </w:tr>
+      <w:tr>
+        <w:tc>
+          <w:tcPr>
+            <w:tcW w:type="dxa" w:w="1211"/>
+          </w:tcPr>
+          <w:p>
+            <w:r/>
+            <w:r>
+              <w:rPr>
+                <w:rFonts w:ascii="Times New Roman" w:hAnsi="Times New Roman"/>
+                <w:sz w:val="18"/>
+              </w:rPr>
+              <w:t>4</w:t>
+            </w:r>
+          </w:p>
+        </w:tc>
+        <w:tc>
+          <w:tcPr>
+            <w:tcW w:type="dxa" w:w="1211"/>
+          </w:tcPr>
+          <w:p>
+            <w:r/>
+            <w:r>
+              <w:rPr>
+                <w:rFonts w:ascii="Times New Roman" w:hAnsi="Times New Roman"/>
+                <w:sz w:val="18"/>
+              </w:rPr>
+              <w:t>A03 Injection</w:t>
+            </w:r>
+          </w:p>
+        </w:tc>
+        <w:tc>
+          <w:tcPr>
+            <w:tcW w:type="dxa" w:w="1211"/>
+          </w:tcPr>
+          <w:p>
+            <w:r/>
+            <w:r>
+              <w:rPr>
+                <w:rFonts w:ascii="Times New Roman" w:hAnsi="Times New Roman"/>
+                <w:sz w:val="18"/>
+              </w:rPr>
+              <w:t>main.py, поиск платежей</w:t>
+            </w:r>
+          </w:p>
+        </w:tc>
+        <w:tc>
+          <w:tcPr>
+            <w:tcW w:type="dxa" w:w="1211"/>
+          </w:tcPr>
+          <w:p>
+            <w:r/>
+            <w:r>
+              <w:rPr>
+                <w:rFonts w:ascii="Times New Roman" w:hAnsi="Times New Roman"/>
+                <w:sz w:val="18"/>
+              </w:rPr>
+              <w:t>AI сгенерировал raw SQL с f-строкой: db.execute(f"SELECT * FROM payments WHERE recipient LIKE '%{q}%'") — SQL-инъекция</w:t>
+            </w:r>
+          </w:p>
+        </w:tc>
+        <w:tc>
+          <w:tcPr>
+            <w:tcW w:type="dxa" w:w="1211"/>
+          </w:tcPr>
+          <w:p>
+            <w:r/>
+            <w:r>
+              <w:rPr>
+                <w:rFonts w:ascii="Times New Roman" w:hAnsi="Times New Roman"/>
+                <w:sz w:val="18"/>
+              </w:rPr>
+              <w:t>Извлечение или модификация произвольных данных в БД</w:t>
+            </w:r>
+          </w:p>
+        </w:tc>
+        <w:tc>
+          <w:tcPr>
+            <w:tcW w:type="dxa" w:w="1211"/>
+          </w:tcPr>
+          <w:p>
+            <w:r/>
+            <w:r>
+              <w:rPr>
+                <w:rFonts w:ascii="Times New Roman" w:hAnsi="Times New Roman"/>
+                <w:sz w:val="18"/>
+              </w:rPr>
+              <w:t>Высокая</w:t>
+            </w:r>
+          </w:p>
+        </w:tc>
+        <w:tc>
+          <w:tcPr>
+            <w:tcW w:type="dxa" w:w="1211"/>
+          </w:tcPr>
+          <w:p>
+            <w:r/>
+            <w:r>
+              <w:rPr>
+                <w:rFonts w:ascii="Times New Roman" w:hAnsi="Times New Roman"/>
+                <w:sz w:val="18"/>
+              </w:rPr>
+              <w:t>Устранена</w:t>
+            </w:r>
+          </w:p>
+        </w:tc>
+        <w:tc>
+          <w:tcPr>
+            <w:tcW w:type="dxa" w:w="1211"/>
+          </w:tcPr>
+          <w:p>
+            <w:r/>
+            <w:r>
+              <w:rPr>
+                <w:rFonts w:ascii="Times New Roman" w:hAnsi="Times New Roman"/>
+                <w:sz w:val="18"/>
+              </w:rPr>
+              <w:t>Поиск переведён на SQLAlchemy ORM: .filter(Payment.recipient.ilike(f'%{q}%'))</w:t>
+            </w:r>
+          </w:p>
+        </w:tc>
+      </w:tr>
+      <w:tr>
+        <w:tc>
+          <w:tcPr>
+            <w:tcW w:type="dxa" w:w="1211"/>
+          </w:tcPr>
+          <w:p>
+            <w:r/>
+            <w:r>
+              <w:rPr>
+                <w:rFonts w:ascii="Times New Roman" w:hAnsi="Times New Roman"/>
+                <w:sz w:val="18"/>
+              </w:rPr>
+              <w:t>5</w:t>
+            </w:r>
+          </w:p>
+        </w:tc>
+        <w:tc>
+          <w:tcPr>
+            <w:tcW w:type="dxa" w:w="1211"/>
+          </w:tcPr>
+          <w:p>
+            <w:r/>
+            <w:r>
+              <w:rPr>
+                <w:rFonts w:ascii="Times New Roman" w:hAnsi="Times New Roman"/>
+                <w:sz w:val="18"/>
+              </w:rPr>
+              <w:t>A07 Authentication Failures</w:t>
+            </w:r>
+          </w:p>
+        </w:tc>
+        <w:tc>
+          <w:tcPr>
+            <w:tcW w:type="dxa" w:w="1211"/>
+          </w:tcPr>
+          <w:p>
+            <w:r/>
+            <w:r>
+              <w:rPr>
+                <w:rFonts w:ascii="Times New Roman" w:hAnsi="Times New Roman"/>
+                <w:sz w:val="18"/>
+              </w:rPr>
+              <w:t>main.py, /login</w:t>
+            </w:r>
+          </w:p>
+        </w:tc>
+        <w:tc>
+          <w:tcPr>
+            <w:tcW w:type="dxa" w:w="1211"/>
+          </w:tcPr>
+          <w:p>
+            <w:r/>
+            <w:r>
+              <w:rPr>
+                <w:rFonts w:ascii="Times New Roman" w:hAnsi="Times New Roman"/>
+                <w:sz w:val="18"/>
+              </w:rPr>
+              <w:t>AI не добавил механизм блокировки аккаунта и ограничение частоты запросов: бесконечный перебор паролей</w:t>
+            </w:r>
+          </w:p>
+        </w:tc>
+        <w:tc>
+          <w:tcPr>
+            <w:tcW w:type="dxa" w:w="1211"/>
+          </w:tcPr>
+          <w:p>
+            <w:r/>
+            <w:r>
+              <w:rPr>
+                <w:rFonts w:ascii="Times New Roman" w:hAnsi="Times New Roman"/>
+                <w:sz w:val="18"/>
+              </w:rPr>
+              <w:t>Брутфорс-атака с подбором паролей без ограничений</w:t>
+            </w:r>
+          </w:p>
+        </w:tc>
+        <w:tc>
+          <w:tcPr>
+            <w:tcW w:type="dxa" w:w="1211"/>
+          </w:tcPr>
+          <w:p>
+            <w:r/>
+            <w:r>
+              <w:rPr>
+                <w:rFonts w:ascii="Times New Roman" w:hAnsi="Times New Roman"/>
+                <w:sz w:val="18"/>
+              </w:rPr>
+              <w:t>Высокая</w:t>
+            </w:r>
+          </w:p>
+        </w:tc>
+        <w:tc>
+          <w:tcPr>
+            <w:tcW w:type="dxa" w:w="1211"/>
+          </w:tcPr>
+          <w:p>
+            <w:r/>
+            <w:r>
+              <w:rPr>
+                <w:rFonts w:ascii="Times New Roman" w:hAnsi="Times New Roman"/>
+                <w:sz w:val="18"/>
+              </w:rPr>
+              <w:t>Устранена</w:t>
+            </w:r>
+          </w:p>
+        </w:tc>
+        <w:tc>
+          <w:tcPr>
+            <w:tcW w:type="dxa" w:w="1211"/>
+          </w:tcPr>
+          <w:p>
+            <w:r/>
+            <w:r>
+              <w:rPr>
+                <w:rFonts w:ascii="Times New Roman" w:hAnsi="Times New Roman"/>
+                <w:sz w:val="18"/>
+              </w:rPr>
+              <w:t>Добавлены failed_attempts + locked_until в модель User; SlowAPI rate limit 5/min на /login</w:t>
+            </w:r>
+          </w:p>
+        </w:tc>
+      </w:tr>
+      <w:tr>
+        <w:tc>
+          <w:tcPr>
+            <w:tcW w:type="dxa" w:w="1211"/>
+          </w:tcPr>
+          <w:p>
+            <w:r/>
+            <w:r>
+              <w:rPr>
+                <w:rFonts w:ascii="Times New Roman" w:hAnsi="Times New Roman"/>
+                <w:sz w:val="18"/>
+              </w:rPr>
+              <w:t>6</w:t>
+            </w:r>
+          </w:p>
+        </w:tc>
+        <w:tc>
+          <w:tcPr>
+            <w:tcW w:type="dxa" w:w="1211"/>
+          </w:tcPr>
+          <w:p>
+            <w:r/>
+            <w:r>
+              <w:rPr>
+                <w:rFonts w:ascii="Times New Roman" w:hAnsi="Times New Roman"/>
+                <w:sz w:val="18"/>
+              </w:rPr>
+              <w:t>A09 Security Logging Failures</w:t>
+            </w:r>
+          </w:p>
+        </w:tc>
+        <w:tc>
+          <w:tcPr>
+            <w:tcW w:type="dxa" w:w="1211"/>
+          </w:tcPr>
+          <w:p>
+            <w:r/>
+            <w:r>
+              <w:rPr>
+                <w:rFonts w:ascii="Times New Roman" w:hAnsi="Times New Roman"/>
+                <w:sz w:val="18"/>
+              </w:rPr>
+              <w:t>main.py, обработчик логина</w:t>
+            </w:r>
+          </w:p>
+        </w:tc>
+        <w:tc>
+          <w:tcPr>
+            <w:tcW w:type="dxa" w:w="1211"/>
+          </w:tcPr>
+          <w:p>
+            <w:r/>
+            <w:r>
+              <w:rPr>
+                <w:rFonts w:ascii="Times New Roman" w:hAnsi="Times New Roman"/>
+                <w:sz w:val="18"/>
+              </w:rPr>
+              <w:t>AI занёс значение поля пароля из формы в детали аудит-записи: details=f'user={username} pass={password}'</w:t>
+            </w:r>
+          </w:p>
+        </w:tc>
+        <w:tc>
+          <w:tcPr>
+            <w:tcW w:type="dxa" w:w="1211"/>
+          </w:tcPr>
+          <w:p>
+            <w:r/>
+            <w:r>
+              <w:rPr>
+                <w:rFonts w:ascii="Times New Roman" w:hAnsi="Times New Roman"/>
+                <w:sz w:val="18"/>
+              </w:rPr>
+              <w:t>Утечка паролей пользователей через журнал аудита</w:t>
+            </w:r>
+          </w:p>
+        </w:tc>
+        <w:tc>
+          <w:tcPr>
+            <w:tcW w:type="dxa" w:w="1211"/>
+          </w:tcPr>
+          <w:p>
+            <w:r/>
+            <w:r>
+              <w:rPr>
+                <w:rFonts w:ascii="Times New Roman" w:hAnsi="Times New Roman"/>
+                <w:sz w:val="18"/>
+              </w:rPr>
+              <w:t>Высокая</w:t>
+            </w:r>
+          </w:p>
+        </w:tc>
+        <w:tc>
+          <w:tcPr>
+            <w:tcW w:type="dxa" w:w="1211"/>
+          </w:tcPr>
+          <w:p>
+            <w:r/>
+            <w:r>
+              <w:rPr>
+                <w:rFonts w:ascii="Times New Roman" w:hAnsi="Times New Roman"/>
+                <w:sz w:val="18"/>
+              </w:rPr>
+              <w:t>Устранена</w:t>
+            </w:r>
+          </w:p>
+        </w:tc>
+        <w:tc>
+          <w:tcPr>
+            <w:tcW w:type="dxa" w:w="1211"/>
+          </w:tcPr>
+          <w:p>
+            <w:r/>
+            <w:r>
+              <w:rPr>
+                <w:rFonts w:ascii="Times New Roman" w:hAnsi="Times New Roman"/>
+                <w:sz w:val="18"/>
+              </w:rPr>
+              <w:t>Из audit details удалено поле пароля; логируется только username и IP</w:t>
+            </w:r>
+          </w:p>
+        </w:tc>
+      </w:tr>
+      <w:tr>
+        <w:tc>
+          <w:tcPr>
+            <w:tcW w:type="dxa" w:w="1211"/>
+          </w:tcPr>
+          <w:p>
+            <w:r/>
+            <w:r>
+              <w:rPr>
+                <w:rFonts w:ascii="Times New Roman" w:hAnsi="Times New Roman"/>
+                <w:sz w:val="18"/>
+              </w:rPr>
+              <w:t>7</w:t>
+            </w:r>
+          </w:p>
+        </w:tc>
+        <w:tc>
+          <w:tcPr>
+            <w:tcW w:type="dxa" w:w="1211"/>
+          </w:tcPr>
+          <w:p>
+            <w:r/>
+            <w:r>
+              <w:rPr>
+                <w:rFonts w:ascii="Times New Roman" w:hAnsi="Times New Roman"/>
+                <w:sz w:val="18"/>
+              </w:rPr>
+              <w:t>A05 Security Misconfiguration</w:t>
+            </w:r>
+          </w:p>
+        </w:tc>
+        <w:tc>
+          <w:tcPr>
+            <w:tcW w:type="dxa" w:w="1211"/>
+          </w:tcPr>
+          <w:p>
+            <w:r/>
+            <w:r>
+              <w:rPr>
+                <w:rFonts w:ascii="Times New Roman" w:hAnsi="Times New Roman"/>
+                <w:sz w:val="18"/>
+              </w:rPr>
+              <w:t>main.py, CORS</w:t>
+            </w:r>
+          </w:p>
+        </w:tc>
+        <w:tc>
+          <w:tcPr>
+            <w:tcW w:type="dxa" w:w="1211"/>
+          </w:tcPr>
+          <w:p>
+            <w:r/>
+            <w:r>
+              <w:rPr>
+                <w:rFonts w:ascii="Times New Roman" w:hAnsi="Times New Roman"/>
+                <w:sz w:val="18"/>
+              </w:rPr>
+              <w:t>AI добавил allow_origins=['*'] в CORSMiddleware без ограничений</w:t>
+            </w:r>
+          </w:p>
+        </w:tc>
+        <w:tc>
+          <w:tcPr>
+            <w:tcW w:type="dxa" w:w="1211"/>
+          </w:tcPr>
+          <w:p>
+            <w:r/>
+            <w:r>
+              <w:rPr>
+                <w:rFonts w:ascii="Times New Roman" w:hAnsi="Times New Roman"/>
+                <w:sz w:val="18"/>
+              </w:rPr>
+              <w:t>Любой сайт может выполнять авторизованные запросы от имени пользователя (CSRF через CORS)</w:t>
+            </w:r>
+          </w:p>
+        </w:tc>
+        <w:tc>
+          <w:tcPr>
+            <w:tcW w:type="dxa" w:w="1211"/>
+          </w:tcPr>
+          <w:p>
+            <w:r/>
+            <w:r>
+              <w:rPr>
+                <w:rFonts w:ascii="Times New Roman" w:hAnsi="Times New Roman"/>
+                <w:sz w:val="18"/>
+              </w:rPr>
+              <w:t>Средняя</w:t>
+            </w:r>
+          </w:p>
+        </w:tc>
+        <w:tc>
+          <w:tcPr>
+            <w:tcW w:type="dxa" w:w="1211"/>
+          </w:tcPr>
+          <w:p>
+            <w:r/>
+            <w:r>
+              <w:rPr>
+                <w:rFonts w:ascii="Times New Roman" w:hAnsi="Times New Roman"/>
+                <w:sz w:val="18"/>
+              </w:rPr>
+              <w:t>Устранена</w:t>
+            </w:r>
+          </w:p>
+        </w:tc>
+        <w:tc>
+          <w:tcPr>
+            <w:tcW w:type="dxa" w:w="1211"/>
+          </w:tcPr>
+          <w:p>
+            <w:r/>
+            <w:r>
+              <w:rPr>
+                <w:rFonts w:ascii="Times New Roman" w:hAnsi="Times New Roman"/>
+                <w:sz w:val="18"/>
+              </w:rPr>
+              <w:t>allow_origins читается из env: ALLOWED_ORIGINS; по умолчанию только localhost</w:t>
+            </w:r>
+          </w:p>
+        </w:tc>
+      </w:tr>
+      <w:tr>
+        <w:tc>
+          <w:tcPr>
+            <w:tcW w:type="dxa" w:w="1211"/>
+          </w:tcPr>
+          <w:p>
+            <w:r/>
+            <w:r>
+              <w:rPr>
+                <w:rFonts w:ascii="Times New Roman" w:hAnsi="Times New Roman"/>
+                <w:sz w:val="18"/>
+              </w:rPr>
+              <w:t>8</w:t>
+            </w:r>
+          </w:p>
+        </w:tc>
+        <w:tc>
+          <w:tcPr>
+            <w:tcW w:type="dxa" w:w="1211"/>
+          </w:tcPr>
+          <w:p>
+            <w:r/>
+            <w:r>
+              <w:rPr>
+                <w:rFonts w:ascii="Times New Roman" w:hAnsi="Times New Roman"/>
+                <w:sz w:val="18"/>
+              </w:rPr>
+              <w:t>A08 Software Integrity Failures</w:t>
+            </w:r>
+          </w:p>
+        </w:tc>
+        <w:tc>
+          <w:tcPr>
+            <w:tcW w:type="dxa" w:w="1211"/>
+          </w:tcPr>
+          <w:p>
+            <w:r/>
+            <w:r>
+              <w:rPr>
+                <w:rFonts w:ascii="Times New Roman" w:hAnsi="Times New Roman"/>
+                <w:sz w:val="18"/>
+              </w:rPr>
+              <w:t>requirements.txt</w:t>
+            </w:r>
+          </w:p>
+        </w:tc>
+        <w:tc>
+          <w:tcPr>
+            <w:tcW w:type="dxa" w:w="1211"/>
+          </w:tcPr>
+          <w:p>
+            <w:r/>
+            <w:r>
+              <w:rPr>
+                <w:rFonts w:ascii="Times New Roman" w:hAnsi="Times New Roman"/>
+                <w:sz w:val="18"/>
+              </w:rPr>
+              <w:t>AI сгенерировал незапиненные зависимости (fastapi&gt;=0.100.0), допуская автоматическую установку уязвимых версий</w:t>
+            </w:r>
+          </w:p>
+        </w:tc>
+        <w:tc>
+          <w:tcPr>
+            <w:tcW w:type="dxa" w:w="1211"/>
+          </w:tcPr>
+          <w:p>
+            <w:r/>
+            <w:r>
+              <w:rPr>
+                <w:rFonts w:ascii="Times New Roman" w:hAnsi="Times New Roman"/>
+                <w:sz w:val="18"/>
+              </w:rPr>
+              <w:t>Непреднамеренная установка зависимостей с известными CVE</w:t>
+            </w:r>
+          </w:p>
+        </w:tc>
+        <w:tc>
+          <w:tcPr>
+            <w:tcW w:type="dxa" w:w="1211"/>
+          </w:tcPr>
+          <w:p>
+            <w:r/>
+            <w:r>
+              <w:rPr>
+                <w:rFonts w:ascii="Times New Roman" w:hAnsi="Times New Roman"/>
+                <w:sz w:val="18"/>
+              </w:rPr>
+              <w:t>Средняя</w:t>
+            </w:r>
+          </w:p>
+        </w:tc>
+        <w:tc>
+          <w:tcPr>
+            <w:tcW w:type="dxa" w:w="1211"/>
+          </w:tcPr>
+          <w:p>
+            <w:r/>
+            <w:r>
+              <w:rPr>
+                <w:rFonts w:ascii="Times New Roman" w:hAnsi="Times New Roman"/>
+                <w:sz w:val="18"/>
+              </w:rPr>
+              <w:t>Устранена</w:t>
+            </w:r>
+          </w:p>
+        </w:tc>
+        <w:tc>
+          <w:tcPr>
+            <w:tcW w:type="dxa" w:w="1211"/>
+          </w:tcPr>
+          <w:p>
+            <w:r/>
+            <w:r>
+              <w:rPr>
+                <w:rFonts w:ascii="Times New Roman" w:hAnsi="Times New Roman"/>
+                <w:sz w:val="18"/>
+              </w:rPr>
+              <w:t>Все версии зафиксированы (fastapi==0.111.0 и т.д.); pip-audit может проверить отсутствие CVE</w:t>
+            </w:r>
+          </w:p>
+        </w:tc>
+      </w:tr>
+      <w:tr>
+        <w:tc>
+          <w:tcPr>
+            <w:tcW w:type="dxa" w:w="1211"/>
+          </w:tcPr>
+          <w:p>
+            <w:r/>
+            <w:r>
+              <w:rPr>
+                <w:rFonts w:ascii="Times New Roman" w:hAnsi="Times New Roman"/>
+                <w:sz w:val="18"/>
+              </w:rPr>
+              <w:t>9</w:t>
+            </w:r>
+          </w:p>
+        </w:tc>
+        <w:tc>
+          <w:tcPr>
+            <w:tcW w:type="dxa" w:w="1211"/>
+          </w:tcPr>
+          <w:p>
+            <w:r/>
+            <w:r>
+              <w:rPr>
+                <w:rFonts w:ascii="Times New Roman" w:hAnsi="Times New Roman"/>
+                <w:sz w:val="18"/>
+              </w:rPr>
+              <w:t>A04 Insecure Design</w:t>
+            </w:r>
+          </w:p>
+        </w:tc>
+        <w:tc>
+          <w:tcPr>
+            <w:tcW w:type="dxa" w:w="1211"/>
+          </w:tcPr>
+          <w:p>
+            <w:r/>
+            <w:r>
+              <w:rPr>
+                <w:rFonts w:ascii="Times New Roman" w:hAnsi="Times New Roman"/>
+                <w:sz w:val="18"/>
+              </w:rPr>
+              <w:t>database.py, auth.py</w:t>
+            </w:r>
+          </w:p>
+        </w:tc>
+        <w:tc>
+          <w:tcPr>
+            <w:tcW w:type="dxa" w:w="1211"/>
+          </w:tcPr>
+          <w:p>
+            <w:r/>
+            <w:r>
+              <w:rPr>
+                <w:rFonts w:ascii="Times New Roman" w:hAnsi="Times New Roman"/>
+                <w:sz w:val="18"/>
+              </w:rPr>
+              <w:t>Первоначально AI не предусмотрел валидацию сложности пароля при регистрации</w:t>
+            </w:r>
+          </w:p>
+        </w:tc>
+        <w:tc>
+          <w:tcPr>
+            <w:tcW w:type="dxa" w:w="1211"/>
+          </w:tcPr>
+          <w:p>
+            <w:r/>
+            <w:r>
+              <w:rPr>
+                <w:rFonts w:ascii="Times New Roman" w:hAnsi="Times New Roman"/>
+                <w:sz w:val="18"/>
+              </w:rPr>
+              <w:t>Пользователи могут задать тривиальный пароль '123', ускоряя брутфорс</w:t>
+            </w:r>
+          </w:p>
+        </w:tc>
+        <w:tc>
+          <w:tcPr>
+            <w:tcW w:type="dxa" w:w="1211"/>
+          </w:tcPr>
+          <w:p>
+            <w:r/>
+            <w:r>
+              <w:rPr>
+                <w:rFonts w:ascii="Times New Roman" w:hAnsi="Times New Roman"/>
+                <w:sz w:val="18"/>
+              </w:rPr>
+              <w:t>Средняя</w:t>
+            </w:r>
+          </w:p>
+        </w:tc>
+        <w:tc>
+          <w:tcPr>
+            <w:tcW w:type="dxa" w:w="1211"/>
+          </w:tcPr>
+          <w:p>
+            <w:r/>
+            <w:r>
+              <w:rPr>
+                <w:rFonts w:ascii="Times New Roman" w:hAnsi="Times New Roman"/>
+                <w:sz w:val="18"/>
+              </w:rPr>
+              <w:t>Устранена</w:t>
+            </w:r>
+          </w:p>
+        </w:tc>
+        <w:tc>
+          <w:tcPr>
+            <w:tcW w:type="dxa" w:w="1211"/>
+          </w:tcPr>
+          <w:p>
+            <w:r/>
+            <w:r>
+              <w:rPr>
+                <w:rFonts w:ascii="Times New Roman" w:hAnsi="Times New Roman"/>
+                <w:sz w:val="18"/>
+              </w:rPr>
+              <w:t>Добавлена функция validate_password() с проверкой длины, регистра, цифр и спецсимволов</w:t>
+            </w:r>
+          </w:p>
+        </w:tc>
+      </w:tr>
+      <w:tr>
+        <w:tc>
+          <w:tcPr>
+            <w:tcW w:type="dxa" w:w="1211"/>
+          </w:tcPr>
+          <w:p>
+            <w:r/>
+            <w:r>
+              <w:rPr>
+                <w:rFonts w:ascii="Times New Roman" w:hAnsi="Times New Roman"/>
+                <w:sz w:val="18"/>
+              </w:rPr>
+              <w:t>10</w:t>
+            </w:r>
+          </w:p>
+        </w:tc>
+        <w:tc>
+          <w:tcPr>
+            <w:tcW w:type="dxa" w:w="1211"/>
+          </w:tcPr>
+          <w:p>
+            <w:r/>
+            <w:r>
+              <w:rPr>
+                <w:rFonts w:ascii="Times New Roman" w:hAnsi="Times New Roman"/>
+                <w:sz w:val="18"/>
+              </w:rPr>
+              <w:t>A10 SSRF / Mishandling Exceptions</w:t>
+            </w:r>
+          </w:p>
+        </w:tc>
+        <w:tc>
+          <w:tcPr>
+            <w:tcW w:type="dxa" w:w="1211"/>
+          </w:tcPr>
+          <w:p>
+            <w:r/>
+            <w:r>
+              <w:rPr>
+                <w:rFonts w:ascii="Times New Roman" w:hAnsi="Times New Roman"/>
+                <w:sz w:val="18"/>
+              </w:rPr>
+              <w:t>main.py, exception handler</w:t>
+            </w:r>
+          </w:p>
+        </w:tc>
+        <w:tc>
+          <w:tcPr>
+            <w:tcW w:type="dxa" w:w="1211"/>
+          </w:tcPr>
+          <w:p>
+            <w:r/>
+            <w:r>
+              <w:rPr>
+                <w:rFonts w:ascii="Times New Roman" w:hAnsi="Times New Roman"/>
+                <w:sz w:val="18"/>
+              </w:rPr>
+              <w:t>При исключении FastAPI возвращал подробный JSON с type и traceback при debug=True</w:t>
+            </w:r>
+          </w:p>
+        </w:tc>
+        <w:tc>
+          <w:tcPr>
+            <w:tcW w:type="dxa" w:w="1211"/>
+          </w:tcPr>
+          <w:p>
+            <w:r/>
+            <w:r>
+              <w:rPr>
+                <w:rFonts w:ascii="Times New Roman" w:hAnsi="Times New Roman"/>
+                <w:sz w:val="18"/>
+              </w:rPr>
+              <w:t>Утечка внутренней информации, путей файловой системы, версий библиотек</w:t>
+            </w:r>
+          </w:p>
+        </w:tc>
+        <w:tc>
+          <w:tcPr>
+            <w:tcW w:type="dxa" w:w="1211"/>
+          </w:tcPr>
+          <w:p>
+            <w:r/>
+            <w:r>
+              <w:rPr>
+                <w:rFonts w:ascii="Times New Roman" w:hAnsi="Times New Roman"/>
+                <w:sz w:val="18"/>
+              </w:rPr>
+              <w:t>Низкая</w:t>
+            </w:r>
+          </w:p>
+        </w:tc>
+        <w:tc>
+          <w:tcPr>
+            <w:tcW w:type="dxa" w:w="1211"/>
+          </w:tcPr>
+          <w:p>
+            <w:r/>
+            <w:r>
+              <w:rPr>
+                <w:rFonts w:ascii="Times New Roman" w:hAnsi="Times New Roman"/>
+                <w:sz w:val="18"/>
+              </w:rPr>
+              <w:t>Устранена</w:t>
+            </w:r>
+          </w:p>
+        </w:tc>
+        <w:tc>
+          <w:tcPr>
+            <w:tcW w:type="dxa" w:w="1211"/>
+          </w:tcPr>
+          <w:p>
+            <w:r/>
+            <w:r>
+              <w:rPr>
+                <w:rFonts w:ascii="Times New Roman" w:hAnsi="Times New Roman"/>
+                <w:sz w:val="18"/>
+              </w:rPr>
+              <w:t>Добавлен глобальный @app.exception_handler(Exception) с generic-ответом; детали логируются только внутренне</w:t>
+            </w:r>
+          </w:p>
+        </w:tc>
+      </w:tr>
+    </w:tbl>
+    <w:p/>
+    <w:p>
+      <w:pPr>
+        <w:spacing w:before="240" w:after="120"/>
+      </w:pPr>
+      <w:r>
+        <w:rPr>
+          <w:rFonts w:ascii="Times New Roman" w:hAnsi="Times New Roman"/>
+          <w:b/>
+          <w:color w:val="1F497D"/>
+          <w:sz w:val="28"/>
+        </w:rPr>
+        <w:t>9. Результаты повторного тестирования</w:t>
+      </w:r>
+    </w:p>
+    <w:p>
+      <w:pPr>
+        <w:spacing w:after="120"/>
+      </w:pPr>
+      <w:r>
+        <w:rPr>
+          <w:rFonts w:ascii="Times New Roman" w:hAnsi="Times New Roman"/>
+        </w:rPr>
+        <w:t>После устранения всех выявленных уязвимостей проведено повторное тестирование по той же методологии. Результаты:</w:t>
+      </w:r>
+    </w:p>
+    <w:p>
+      <w:pPr>
+        <w:spacing w:after="120"/>
+      </w:pPr>
+      <w:r>
+        <w:rPr>
+          <w:rFonts w:ascii="Times New Roman" w:hAnsi="Times New Roman"/>
+        </w:rPr>
+        <w:t>A01 Broken Access Control: повторное тестирование подтвердило — попытка GET /dashboard от пользователя user2 возвращает только его платежи; прямой запрос с user_id другого пользователя блокируется.</w:t>
+      </w:r>
+    </w:p>
+    <w:p>
+      <w:pPr>
+        <w:spacing w:after="120"/>
+      </w:pPr>
+      <w:r>
+        <w:rPr>
+          <w:rFonts w:ascii="Times New Roman" w:hAnsi="Times New Roman"/>
+        </w:rPr>
+        <w:t>A02 Cryptographic Failures: SECRET_KEY обязательно задаётся в .env; при попытке запустить приложение без переменной выдаётся RuntimeError до обработки каких-либо запросов.</w:t>
+      </w:r>
+    </w:p>
+    <w:p>
+      <w:pPr>
+        <w:spacing w:after="120"/>
+      </w:pPr>
+      <w:r>
+        <w:rPr>
+          <w:rFonts w:ascii="Times New Roman" w:hAnsi="Times New Roman"/>
+        </w:rPr>
+        <w:t>A03 Injection: поиск переведён на ORM; параметр q передаётся через ilike() — SQL-инъекция недостижима.</w:t>
+      </w:r>
+    </w:p>
+    <w:p>
+      <w:pPr>
+        <w:spacing w:after="120"/>
+      </w:pPr>
+      <w:r>
+        <w:rPr>
+          <w:rFonts w:ascii="Times New Roman" w:hAnsi="Times New Roman"/>
+        </w:rPr>
+        <w:t>A05 Security Misconfiguration: debug=False в production; CORS ограничен переменной ALLOWED_ORIGINS. Стек-трейсы более не возвращаются клиенту.</w:t>
+      </w:r>
+    </w:p>
+    <w:p>
+      <w:pPr>
+        <w:spacing w:after="120"/>
+      </w:pPr>
+      <w:r>
+        <w:rPr>
+          <w:rFonts w:ascii="Times New Roman" w:hAnsi="Times New Roman"/>
+        </w:rPr>
+        <w:t>A07 Authentication Failures: после 5 неверных попыток аккаунт блокируется на 15 минут; ответ не раскрывает факт блокировки — возвращается общее "Неверный логин или пароль".</w:t>
+      </w:r>
+    </w:p>
+    <w:p>
+      <w:pPr>
+        <w:spacing w:after="120"/>
+      </w:pPr>
+      <w:r>
+        <w:rPr>
+          <w:rFonts w:ascii="Times New Roman" w:hAnsi="Times New Roman"/>
+        </w:rPr>
+        <w:t>A09 Logging: проверка записей audit_logs после успешного и неуспешного логина подтвердила отсутствие полей пароля.</w:t>
+      </w:r>
+    </w:p>
+    <w:p>
+      <w:pPr>
+        <w:spacing w:after="120"/>
+      </w:pPr>
+      <w:r>
+        <w:rPr>
+          <w:rFonts w:ascii="Times New Roman" w:hAnsi="Times New Roman"/>
+        </w:rPr>
+        <w:t>Все 10 выявленных проблем устранены. Повторный анализ не выявил новых критических или высоких уязвимостей.</w:t>
+      </w:r>
+    </w:p>
+    <w:p>
+      <w:pPr>
+        <w:spacing w:before="240" w:after="120"/>
+      </w:pPr>
+      <w:r>
+        <w:rPr>
+          <w:rFonts w:ascii="Times New Roman" w:hAnsi="Times New Roman"/>
+          <w:b/>
+          <w:color w:val="1F497D"/>
+          <w:sz w:val="28"/>
+        </w:rPr>
+        <w:t>Сравнительный анализ: ручная разработка и AI-ассистированная разработка</w:t>
+      </w:r>
+    </w:p>
+    <w:p>
+      <w:pPr>
+        <w:spacing w:after="120"/>
+      </w:pPr>
+      <w:r>
+        <w:rPr>
+          <w:rFonts w:ascii="Times New Roman" w:hAnsi="Times New Roman"/>
+        </w:rPr>
+        <w:t>Таблица 10 — Сравнительный анализ версий MVP по критериям безопасности и качества разработки</w:t>
+      </w:r>
+    </w:p>
+    <w:tbl>
+      <w:tblPr>
+        <w:tblStyle w:val="TableGrid"/>
+        <w:tblW w:type="auto" w:w="0"/>
+        <w:tblLook w:firstColumn="1" w:firstRow="1" w:lastColumn="0" w:lastRow="0" w:noHBand="0" w:noVBand="1" w:val="04A0"/>
+      </w:tblPr>
+      <w:tblGrid>
+        <w:gridCol w:w="2422"/>
+        <w:gridCol w:w="2422"/>
+        <w:gridCol w:w="2422"/>
+        <w:gridCol w:w="2422"/>
+      </w:tblGrid>
+      <w:tr>
+        <w:tc>
+          <w:tcPr>
+            <w:tcW w:type="dxa" w:w="2422"/>
+            <w:shd w:val="clear" w:color="auto" w:fill="D0D8E8"/>
+          </w:tcPr>
+          <w:p>
+            <w:r/>
+            <w:r>
+              <w:rPr>
+                <w:rFonts w:ascii="Times New Roman" w:hAnsi="Times New Roman"/>
+                <w:b/>
+                <w:sz w:val="18"/>
+              </w:rPr>
+              <w:t>N</w:t>
+            </w:r>
+          </w:p>
+        </w:tc>
+        <w:tc>
+          <w:tcPr>
+            <w:tcW w:type="dxa" w:w="2422"/>
+            <w:shd w:val="clear" w:color="auto" w:fill="D0D8E8"/>
+          </w:tcPr>
+          <w:p>
+            <w:r/>
+            <w:r>
+              <w:rPr>
+                <w:rFonts w:ascii="Times New Roman" w:hAnsi="Times New Roman"/>
+                <w:b/>
+                <w:sz w:val="18"/>
+              </w:rPr>
+              <w:t>Критерий сравнения</w:t>
+            </w:r>
+          </w:p>
+        </w:tc>
+        <w:tc>
+          <w:tcPr>
+            <w:tcW w:type="dxa" w:w="2422"/>
+            <w:shd w:val="clear" w:color="auto" w:fill="D0D8E8"/>
+          </w:tcPr>
+          <w:p>
+            <w:r/>
+            <w:r>
+              <w:rPr>
+                <w:rFonts w:ascii="Times New Roman" w:hAnsi="Times New Roman"/>
+                <w:b/>
+                <w:sz w:val="18"/>
+              </w:rPr>
+              <w:t>Задание 1 (Go, ручная разработка)</w:t>
+            </w:r>
+          </w:p>
+        </w:tc>
+        <w:tc>
+          <w:tcPr>
+            <w:tcW w:type="dxa" w:w="2422"/>
+            <w:shd w:val="clear" w:color="auto" w:fill="D0D8E8"/>
+          </w:tcPr>
+          <w:p>
+            <w:r/>
+            <w:r>
+              <w:rPr>
+                <w:rFonts w:ascii="Times New Roman" w:hAnsi="Times New Roman"/>
+                <w:b/>
+                <w:sz w:val="18"/>
+              </w:rPr>
+              <w:t>Задание 2 (Python, AI-ассистированная)</w:t>
+            </w:r>
+          </w:p>
+        </w:tc>
+      </w:tr>
+      <w:tr>
+        <w:tc>
+          <w:tcPr>
+            <w:tcW w:type="dxa" w:w="2422"/>
+          </w:tcPr>
+          <w:p>
+            <w:r/>
+            <w:r>
+              <w:rPr>
+                <w:rFonts w:ascii="Times New Roman" w:hAnsi="Times New Roman"/>
+                <w:sz w:val="18"/>
+              </w:rPr>
+              <w:t>1</w:t>
+            </w:r>
+          </w:p>
+        </w:tc>
+        <w:tc>
+          <w:tcPr>
+            <w:tcW w:type="dxa" w:w="2422"/>
+          </w:tcPr>
+          <w:p>
+            <w:r/>
+            <w:r>
+              <w:rPr>
+                <w:rFonts w:ascii="Times New Roman" w:hAnsi="Times New Roman"/>
+                <w:sz w:val="18"/>
+              </w:rPr>
+              <w:t>Время разработки базовой функциональности</w:t>
+            </w:r>
+          </w:p>
+        </w:tc>
+        <w:tc>
+          <w:tcPr>
+            <w:tcW w:type="dxa" w:w="2422"/>
+          </w:tcPr>
+          <w:p>
+            <w:r/>
+            <w:r>
+              <w:rPr>
+                <w:rFonts w:ascii="Times New Roman" w:hAnsi="Times New Roman"/>
+                <w:sz w:val="18"/>
+              </w:rPr>
+              <w:t>Высокие затраты (ручное написание всех компонентов, ~14–18 ч)</w:t>
+            </w:r>
+          </w:p>
+        </w:tc>
+        <w:tc>
+          <w:tcPr>
+            <w:tcW w:type="dxa" w:w="2422"/>
+          </w:tcPr>
+          <w:p>
+            <w:r/>
+            <w:r>
+              <w:rPr>
+                <w:rFonts w:ascii="Times New Roman" w:hAnsi="Times New Roman"/>
+                <w:sz w:val="18"/>
+              </w:rPr>
+              <w:t>Существенно ниже: AI генерирует шаблоны, маршруты и модели (~5–7 ч)</w:t>
+            </w:r>
+          </w:p>
+        </w:tc>
+      </w:tr>
+      <w:tr>
+        <w:tc>
+          <w:tcPr>
+            <w:tcW w:type="dxa" w:w="2422"/>
+          </w:tcPr>
+          <w:p>
+            <w:r/>
+            <w:r>
+              <w:rPr>
+                <w:rFonts w:ascii="Times New Roman" w:hAnsi="Times New Roman"/>
+                <w:sz w:val="18"/>
+              </w:rPr>
+              <w:t>2</w:t>
+            </w:r>
+          </w:p>
+        </w:tc>
+        <w:tc>
+          <w:tcPr>
+            <w:tcW w:type="dxa" w:w="2422"/>
+          </w:tcPr>
+          <w:p>
+            <w:r/>
+            <w:r>
+              <w:rPr>
+                <w:rFonts w:ascii="Times New Roman" w:hAnsi="Times New Roman"/>
+                <w:sz w:val="18"/>
+              </w:rPr>
+              <w:t>Контроль доступа (A01)</w:t>
+            </w:r>
+          </w:p>
+        </w:tc>
+        <w:tc>
+          <w:tcPr>
+            <w:tcW w:type="dxa" w:w="2422"/>
+          </w:tcPr>
+          <w:p>
+            <w:r/>
+            <w:r>
+              <w:rPr>
+                <w:rFonts w:ascii="Times New Roman" w:hAnsi="Times New Roman"/>
+                <w:sz w:val="18"/>
+              </w:rPr>
+              <w:t>Проверки RBAC на всех маршрутах реализованы намеренно с первого шага</w:t>
+            </w:r>
+          </w:p>
+        </w:tc>
+        <w:tc>
+          <w:tcPr>
+            <w:tcW w:type="dxa" w:w="2422"/>
+          </w:tcPr>
+          <w:p>
+            <w:r/>
+            <w:r>
+              <w:rPr>
+                <w:rFonts w:ascii="Times New Roman" w:hAnsi="Times New Roman"/>
+                <w:sz w:val="18"/>
+              </w:rPr>
+              <w:t>AI изначально пропустил фильтр по user_id (IDOR); потребовалась ручная правка</w:t>
+            </w:r>
+          </w:p>
+        </w:tc>
+      </w:tr>
+      <w:tr>
+        <w:tc>
+          <w:tcPr>
+            <w:tcW w:type="dxa" w:w="2422"/>
+          </w:tcPr>
+          <w:p>
+            <w:r/>
+            <w:r>
+              <w:rPr>
+                <w:rFonts w:ascii="Times New Roman" w:hAnsi="Times New Roman"/>
+                <w:sz w:val="18"/>
+              </w:rPr>
+              <w:t>3</w:t>
+            </w:r>
+          </w:p>
+        </w:tc>
+        <w:tc>
+          <w:tcPr>
+            <w:tcW w:type="dxa" w:w="2422"/>
+          </w:tcPr>
+          <w:p>
+            <w:r/>
+            <w:r>
+              <w:rPr>
+                <w:rFonts w:ascii="Times New Roman" w:hAnsi="Times New Roman"/>
+                <w:sz w:val="18"/>
+              </w:rPr>
+              <w:t>Аутентификация (A07)</w:t>
+            </w:r>
+          </w:p>
+        </w:tc>
+        <w:tc>
+          <w:tcPr>
+            <w:tcW w:type="dxa" w:w="2422"/>
+          </w:tcPr>
+          <w:p>
+            <w:r/>
+            <w:r>
+              <w:rPr>
+                <w:rFonts w:ascii="Times New Roman" w:hAnsi="Times New Roman"/>
+                <w:sz w:val="18"/>
+              </w:rPr>
+              <w:t>MFA/TOTP, блокировка аккаунта, CSRF, jti в JWT реализованы в первой итерации</w:t>
+            </w:r>
+          </w:p>
+        </w:tc>
+        <w:tc>
+          <w:tcPr>
+            <w:tcW w:type="dxa" w:w="2422"/>
+          </w:tcPr>
+          <w:p>
+            <w:r/>
+            <w:r>
+              <w:rPr>
+                <w:rFonts w:ascii="Times New Roman" w:hAnsi="Times New Roman"/>
+                <w:sz w:val="18"/>
+              </w:rPr>
+              <w:t>AI реализовал базовую JWT-аутентификацию без MFA и без блокировки; добавлено вручную</w:t>
+            </w:r>
+          </w:p>
+        </w:tc>
+      </w:tr>
+      <w:tr>
+        <w:tc>
+          <w:tcPr>
+            <w:tcW w:type="dxa" w:w="2422"/>
+          </w:tcPr>
+          <w:p>
+            <w:r/>
+            <w:r>
+              <w:rPr>
+                <w:rFonts w:ascii="Times New Roman" w:hAnsi="Times New Roman"/>
+                <w:sz w:val="18"/>
+              </w:rPr>
+              <w:t>4</w:t>
+            </w:r>
+          </w:p>
+        </w:tc>
+        <w:tc>
+          <w:tcPr>
+            <w:tcW w:type="dxa" w:w="2422"/>
+          </w:tcPr>
+          <w:p>
+            <w:r/>
+            <w:r>
+              <w:rPr>
+                <w:rFonts w:ascii="Times New Roman" w:hAnsi="Times New Roman"/>
+                <w:sz w:val="18"/>
+              </w:rPr>
+              <w:t>Криптографическая стойкость (A02)</w:t>
+            </w:r>
+          </w:p>
+        </w:tc>
+        <w:tc>
+          <w:tcPr>
+            <w:tcW w:type="dxa" w:w="2422"/>
+          </w:tcPr>
+          <w:p>
+            <w:r/>
+            <w:r>
+              <w:rPr>
+                <w:rFonts w:ascii="Times New Roman" w:hAnsi="Times New Roman"/>
+                <w:sz w:val="18"/>
+              </w:rPr>
+              <w:t>Жёсткий секрет исключён на уровне архитектуры; HMAC-CSRF; TOTP</w:t>
+            </w:r>
+          </w:p>
+        </w:tc>
+        <w:tc>
+          <w:tcPr>
+            <w:tcW w:type="dxa" w:w="2422"/>
+          </w:tcPr>
+          <w:p>
+            <w:r/>
+            <w:r>
+              <w:rPr>
+                <w:rFonts w:ascii="Times New Roman" w:hAnsi="Times New Roman"/>
+                <w:sz w:val="18"/>
+              </w:rPr>
+              <w:t>AI задал SECRET_KEY='secret' по умолчанию; исправлено добавлением обязательной env-переменной</w:t>
+            </w:r>
+          </w:p>
+        </w:tc>
+      </w:tr>
+      <w:tr>
+        <w:tc>
+          <w:tcPr>
+            <w:tcW w:type="dxa" w:w="2422"/>
+          </w:tcPr>
+          <w:p>
+            <w:r/>
+            <w:r>
+              <w:rPr>
+                <w:rFonts w:ascii="Times New Roman" w:hAnsi="Times New Roman"/>
+                <w:sz w:val="18"/>
+              </w:rPr>
+              <w:t>5</w:t>
+            </w:r>
+          </w:p>
+        </w:tc>
+        <w:tc>
+          <w:tcPr>
+            <w:tcW w:type="dxa" w:w="2422"/>
+          </w:tcPr>
+          <w:p>
+            <w:r/>
+            <w:r>
+              <w:rPr>
+                <w:rFonts w:ascii="Times New Roman" w:hAnsi="Times New Roman"/>
+                <w:sz w:val="18"/>
+              </w:rPr>
+              <w:t>Инъекции (A03)</w:t>
+            </w:r>
+          </w:p>
+        </w:tc>
+        <w:tc>
+          <w:tcPr>
+            <w:tcW w:type="dxa" w:w="2422"/>
+          </w:tcPr>
+          <w:p>
+            <w:r/>
+            <w:r>
+              <w:rPr>
+                <w:rFonts w:ascii="Times New Roman" w:hAnsi="Times New Roman"/>
+                <w:sz w:val="18"/>
+              </w:rPr>
+              <w:t>Параметризованные запросы используются везде (raw SQL с ?-плейсхолдерами)</w:t>
+            </w:r>
+          </w:p>
+        </w:tc>
+        <w:tc>
+          <w:tcPr>
+            <w:tcW w:type="dxa" w:w="2422"/>
+          </w:tcPr>
+          <w:p>
+            <w:r/>
+            <w:r>
+              <w:rPr>
+                <w:rFonts w:ascii="Times New Roman" w:hAnsi="Times New Roman"/>
+                <w:sz w:val="18"/>
+              </w:rPr>
+              <w:t>SQLAlchemy ORM предотвращает большинство инъекций, однако AI добавил один raw-запрос с f-строкой</w:t>
+            </w:r>
+          </w:p>
+        </w:tc>
+      </w:tr>
+      <w:tr>
+        <w:tc>
+          <w:tcPr>
+            <w:tcW w:type="dxa" w:w="2422"/>
+          </w:tcPr>
+          <w:p>
+            <w:r/>
+            <w:r>
+              <w:rPr>
+                <w:rFonts w:ascii="Times New Roman" w:hAnsi="Times New Roman"/>
+                <w:sz w:val="18"/>
+              </w:rPr>
+              <w:t>6</w:t>
+            </w:r>
+          </w:p>
+        </w:tc>
+        <w:tc>
+          <w:tcPr>
+            <w:tcW w:type="dxa" w:w="2422"/>
+          </w:tcPr>
+          <w:p>
+            <w:r/>
+            <w:r>
+              <w:rPr>
+                <w:rFonts w:ascii="Times New Roman" w:hAnsi="Times New Roman"/>
+                <w:sz w:val="18"/>
+              </w:rPr>
+              <w:t>Конфигурация безопасности (A05)</w:t>
+            </w:r>
+          </w:p>
+        </w:tc>
+        <w:tc>
+          <w:tcPr>
+            <w:tcW w:type="dxa" w:w="2422"/>
+          </w:tcPr>
+          <w:p>
+            <w:r/>
+            <w:r>
+              <w:rPr>
+                <w:rFonts w:ascii="Times New Roman" w:hAnsi="Times New Roman"/>
+                <w:sz w:val="18"/>
+              </w:rPr>
+              <w:t>Нет небезопасных дефолтов: все заглушки указывают на обязательные переменные</w:t>
+            </w:r>
+          </w:p>
+        </w:tc>
+        <w:tc>
+          <w:tcPr>
+            <w:tcW w:type="dxa" w:w="2422"/>
+          </w:tcPr>
+          <w:p>
+            <w:r/>
+            <w:r>
+              <w:rPr>
+                <w:rFonts w:ascii="Times New Roman" w:hAnsi="Times New Roman"/>
+                <w:sz w:val="18"/>
+              </w:rPr>
+              <w:t>AI оставил debug=True и CORS=* по умолчанию; оба исправлены после аудита</w:t>
+            </w:r>
+          </w:p>
+        </w:tc>
+      </w:tr>
+      <w:tr>
+        <w:tc>
+          <w:tcPr>
+            <w:tcW w:type="dxa" w:w="2422"/>
+          </w:tcPr>
+          <w:p>
+            <w:r/>
+            <w:r>
+              <w:rPr>
+                <w:rFonts w:ascii="Times New Roman" w:hAnsi="Times New Roman"/>
+                <w:sz w:val="18"/>
+              </w:rPr>
+              <w:t>7</w:t>
+            </w:r>
+          </w:p>
+        </w:tc>
+        <w:tc>
+          <w:tcPr>
+            <w:tcW w:type="dxa" w:w="2422"/>
+          </w:tcPr>
+          <w:p>
+            <w:r/>
+            <w:r>
+              <w:rPr>
+                <w:rFonts w:ascii="Times New Roman" w:hAnsi="Times New Roman"/>
+                <w:sz w:val="18"/>
+              </w:rPr>
+              <w:t>Журналирование (A09)</w:t>
+            </w:r>
+          </w:p>
+        </w:tc>
+        <w:tc>
+          <w:tcPr>
+            <w:tcW w:type="dxa" w:w="2422"/>
+          </w:tcPr>
+          <w:p>
+            <w:r/>
+            <w:r>
+              <w:rPr>
+                <w:rFonts w:ascii="Times New Roman" w:hAnsi="Times New Roman"/>
+                <w:sz w:val="18"/>
+              </w:rPr>
+              <w:t>Структурированные логи без PII с первого шага; типизированные action-константы</w:t>
+            </w:r>
+          </w:p>
+        </w:tc>
+        <w:tc>
+          <w:tcPr>
+            <w:tcW w:type="dxa" w:w="2422"/>
+          </w:tcPr>
+          <w:p>
+            <w:r/>
+            <w:r>
+              <w:rPr>
+                <w:rFonts w:ascii="Times New Roman" w:hAnsi="Times New Roman"/>
+                <w:sz w:val="18"/>
+              </w:rPr>
+              <w:t>AI занёс пароль в audit-запись; исправлено; уровень покрытия событий несколько ниже</w:t>
+            </w:r>
+          </w:p>
+        </w:tc>
+      </w:tr>
+      <w:tr>
+        <w:tc>
+          <w:tcPr>
+            <w:tcW w:type="dxa" w:w="2422"/>
+          </w:tcPr>
+          <w:p>
+            <w:r/>
+            <w:r>
+              <w:rPr>
+                <w:rFonts w:ascii="Times New Roman" w:hAnsi="Times New Roman"/>
+                <w:sz w:val="18"/>
+              </w:rPr>
+              <w:t>8</w:t>
+            </w:r>
+          </w:p>
+        </w:tc>
+        <w:tc>
+          <w:tcPr>
+            <w:tcW w:type="dxa" w:w="2422"/>
+          </w:tcPr>
+          <w:p>
+            <w:r/>
+            <w:r>
+              <w:rPr>
+                <w:rFonts w:ascii="Times New Roman" w:hAnsi="Times New Roman"/>
+                <w:sz w:val="18"/>
+              </w:rPr>
+              <w:t>Целостность зависимостей (A08)</w:t>
+            </w:r>
+          </w:p>
+        </w:tc>
+        <w:tc>
+          <w:tcPr>
+            <w:tcW w:type="dxa" w:w="2422"/>
+          </w:tcPr>
+          <w:p>
+            <w:r/>
+            <w:r>
+              <w:rPr>
+                <w:rFonts w:ascii="Times New Roman" w:hAnsi="Times New Roman"/>
+                <w:sz w:val="18"/>
+              </w:rPr>
+              <w:t>go.sum содержит криптографические хеши всех модулей; сверка при сборке</w:t>
+            </w:r>
+          </w:p>
+        </w:tc>
+        <w:tc>
+          <w:tcPr>
+            <w:tcW w:type="dxa" w:w="2422"/>
+          </w:tcPr>
+          <w:p>
+            <w:r/>
+            <w:r>
+              <w:rPr>
+                <w:rFonts w:ascii="Times New Roman" w:hAnsi="Times New Roman"/>
+                <w:sz w:val="18"/>
+              </w:rPr>
+              <w:t>requirements.txt без хешей; AI использовал диапазоны версий; закреплены вручную</w:t>
+            </w:r>
+          </w:p>
+        </w:tc>
+      </w:tr>
+      <w:tr>
+        <w:tc>
+          <w:tcPr>
+            <w:tcW w:type="dxa" w:w="2422"/>
+          </w:tcPr>
+          <w:p>
+            <w:r/>
+            <w:r>
+              <w:rPr>
+                <w:rFonts w:ascii="Times New Roman" w:hAnsi="Times New Roman"/>
+                <w:sz w:val="18"/>
+              </w:rPr>
+              <w:t>9</w:t>
+            </w:r>
+          </w:p>
+        </w:tc>
+        <w:tc>
+          <w:tcPr>
+            <w:tcW w:type="dxa" w:w="2422"/>
+          </w:tcPr>
+          <w:p>
+            <w:r/>
+            <w:r>
+              <w:rPr>
+                <w:rFonts w:ascii="Times New Roman" w:hAnsi="Times New Roman"/>
+                <w:sz w:val="18"/>
+              </w:rPr>
+              <w:t>Обработка ошибок (A10)</w:t>
+            </w:r>
+          </w:p>
+        </w:tc>
+        <w:tc>
+          <w:tcPr>
+            <w:tcW w:type="dxa" w:w="2422"/>
+          </w:tcPr>
+          <w:p>
+            <w:r/>
+            <w:r>
+              <w:rPr>
+                <w:rFonts w:ascii="Times New Roman" w:hAnsi="Times New Roman"/>
+                <w:sz w:val="18"/>
+              </w:rPr>
+              <w:t>Универсальные сообщения с первого шага; детали только в лог-файле</w:t>
+            </w:r>
+          </w:p>
+        </w:tc>
+        <w:tc>
+          <w:tcPr>
+            <w:tcW w:type="dxa" w:w="2422"/>
+          </w:tcPr>
+          <w:p>
+            <w:r/>
+            <w:r>
+              <w:rPr>
+                <w:rFonts w:ascii="Times New Roman" w:hAnsi="Times New Roman"/>
+                <w:sz w:val="18"/>
+              </w:rPr>
+              <w:t>debug=True раскрывал трассировки; добавлен глобальный exception handler</w:t>
+            </w:r>
+          </w:p>
+        </w:tc>
+      </w:tr>
+      <w:tr>
+        <w:tc>
+          <w:tcPr>
+            <w:tcW w:type="dxa" w:w="2422"/>
+          </w:tcPr>
+          <w:p>
+            <w:r/>
+            <w:r>
+              <w:rPr>
+                <w:rFonts w:ascii="Times New Roman" w:hAnsi="Times New Roman"/>
+                <w:sz w:val="18"/>
+              </w:rPr>
+              <w:t>10</w:t>
+            </w:r>
+          </w:p>
+        </w:tc>
+        <w:tc>
+          <w:tcPr>
+            <w:tcW w:type="dxa" w:w="2422"/>
+          </w:tcPr>
+          <w:p>
+            <w:r/>
+            <w:r>
+              <w:rPr>
+                <w:rFonts w:ascii="Times New Roman" w:hAnsi="Times New Roman"/>
+                <w:sz w:val="18"/>
+              </w:rPr>
+              <w:t>Качество кода и поддерживаемость</w:t>
+            </w:r>
+          </w:p>
+        </w:tc>
+        <w:tc>
+          <w:tcPr>
+            <w:tcW w:type="dxa" w:w="2422"/>
+          </w:tcPr>
+          <w:p>
+            <w:r/>
+            <w:r>
+              <w:rPr>
+                <w:rFonts w:ascii="Times New Roman" w:hAnsi="Times New Roman"/>
+                <w:sz w:val="18"/>
+              </w:rPr>
+              <w:t>Явная типизация Go, разбивка по пакетам, минимальный размер функций</w:t>
+            </w:r>
+          </w:p>
+        </w:tc>
+        <w:tc>
+          <w:tcPr>
+            <w:tcW w:type="dxa" w:w="2422"/>
+          </w:tcPr>
+          <w:p>
+            <w:r/>
+            <w:r>
+              <w:rPr>
+                <w:rFonts w:ascii="Times New Roman" w:hAnsi="Times New Roman"/>
+                <w:sz w:val="18"/>
+              </w:rPr>
+              <w:t>Монолитный main.py (~450 строк); AI генерирует рабочий, но менее структурированный код</w:t>
+            </w:r>
+          </w:p>
+        </w:tc>
+      </w:tr>
+      <w:tr>
+        <w:tc>
+          <w:tcPr>
+            <w:tcW w:type="dxa" w:w="2422"/>
+          </w:tcPr>
+          <w:p>
+            <w:r/>
+            <w:r>
+              <w:rPr>
+                <w:rFonts w:ascii="Times New Roman" w:hAnsi="Times New Roman"/>
+                <w:sz w:val="18"/>
+              </w:rPr>
+              <w:t>11</w:t>
+            </w:r>
+          </w:p>
+        </w:tc>
+        <w:tc>
+          <w:tcPr>
+            <w:tcW w:type="dxa" w:w="2422"/>
+          </w:tcPr>
+          <w:p>
+            <w:r/>
+            <w:r>
+              <w:rPr>
+                <w:rFonts w:ascii="Times New Roman" w:hAnsi="Times New Roman"/>
+                <w:sz w:val="18"/>
+              </w:rPr>
+              <w:t>Покрытие MFA</w:t>
+            </w:r>
+          </w:p>
+        </w:tc>
+        <w:tc>
+          <w:tcPr>
+            <w:tcW w:type="dxa" w:w="2422"/>
+          </w:tcPr>
+          <w:p>
+            <w:r/>
+            <w:r>
+              <w:rPr>
+                <w:rFonts w:ascii="Times New Roman" w:hAnsi="Times New Roman"/>
+                <w:sz w:val="18"/>
+              </w:rPr>
+              <w:t>TOTP (RFC 6238) с полным flow: setup, QR, verify, disable</w:t>
+            </w:r>
+          </w:p>
+        </w:tc>
+        <w:tc>
+          <w:tcPr>
+            <w:tcW w:type="dxa" w:w="2422"/>
+          </w:tcPr>
+          <w:p>
+            <w:r/>
+            <w:r>
+              <w:rPr>
+                <w:rFonts w:ascii="Times New Roman" w:hAnsi="Times New Roman"/>
+                <w:sz w:val="18"/>
+              </w:rPr>
+              <w:t>MFA не реализован в AI-версии (AI не добавил без явного запроса)</w:t>
+            </w:r>
+          </w:p>
+        </w:tc>
+      </w:tr>
+      <w:tr>
+        <w:tc>
+          <w:tcPr>
+            <w:tcW w:type="dxa" w:w="2422"/>
+          </w:tcPr>
+          <w:p>
+            <w:r/>
+            <w:r>
+              <w:rPr>
+                <w:rFonts w:ascii="Times New Roman" w:hAnsi="Times New Roman"/>
+                <w:sz w:val="18"/>
+              </w:rPr>
+              <w:t>12</w:t>
+            </w:r>
+          </w:p>
+        </w:tc>
+        <w:tc>
+          <w:tcPr>
+            <w:tcW w:type="dxa" w:w="2422"/>
+          </w:tcPr>
+          <w:p>
+            <w:r/>
+            <w:r>
+              <w:rPr>
+                <w:rFonts w:ascii="Times New Roman" w:hAnsi="Times New Roman"/>
+                <w:sz w:val="18"/>
+              </w:rPr>
+              <w:t>Скорость итераций при исправлении уязвимостей</w:t>
+            </w:r>
+          </w:p>
+        </w:tc>
+        <w:tc>
+          <w:tcPr>
+            <w:tcW w:type="dxa" w:w="2422"/>
+          </w:tcPr>
+          <w:p>
+            <w:r/>
+            <w:r>
+              <w:rPr>
+                <w:rFonts w:ascii="Times New Roman" w:hAnsi="Times New Roman"/>
+                <w:sz w:val="18"/>
+              </w:rPr>
+              <w:t>Требует понимания Go-экосистемы, более медленный рефакторинг</w:t>
+            </w:r>
+          </w:p>
+        </w:tc>
+        <w:tc>
+          <w:tcPr>
+            <w:tcW w:type="dxa" w:w="2422"/>
+          </w:tcPr>
+          <w:p>
+            <w:r/>
+            <w:r>
+              <w:rPr>
+                <w:rFonts w:ascii="Times New Roman" w:hAnsi="Times New Roman"/>
+                <w:sz w:val="18"/>
+              </w:rPr>
+              <w:t>AI помогает быстро применить патчи при наличии конкретного описания уязвимости</w:t>
+            </w:r>
+          </w:p>
+        </w:tc>
+      </w:tr>
+    </w:tbl>
+    <w:p/>
+    <w:p>
+      <w:pPr>
+        <w:spacing w:before="240" w:after="120"/>
+      </w:pPr>
+      <w:r>
+        <w:rPr>
+          <w:rFonts w:ascii="Times New Roman" w:hAnsi="Times New Roman"/>
+          <w:b/>
+          <w:color w:val="1F497D"/>
+          <w:sz w:val="28"/>
+        </w:rPr>
+        <w:t>Выводы по заданию 2</w:t>
+      </w:r>
+    </w:p>
+    <w:p>
+      <w:pPr>
+        <w:spacing w:after="120"/>
+      </w:pPr>
+      <w:r>
+        <w:rPr>
+          <w:rFonts w:ascii="Times New Roman" w:hAnsi="Times New Roman"/>
+        </w:rPr>
+        <w:t>AI-инструменты значительно ускоряют создание работоспособного прототипа: базовая структура приложения, маршруты и модели данных были сгенерированы за часы, а не дни. Однако анализ защищённости выявил характерную закономерность: AI воспроизводит часто встречающиеся в обучающих данных паттерны, не обеспечивая безопасности по умолчанию. Большинство уязвимостей возникло именно из-за этого — значения по умолчанию ('secret', debug=True, CORS=*), пропущенные проверки доступа и незафиксированные зависимости.</w:t>
+      </w:r>
+    </w:p>
+    <w:p>
+      <w:pPr>
+        <w:spacing w:after="120"/>
+      </w:pPr>
+      <w:r>
+        <w:rPr>
+          <w:rFonts w:ascii="Times New Roman" w:hAnsi="Times New Roman"/>
+        </w:rPr>
+        <w:t>Сравнительный анализ показывает, что ручная разработка с опытом в области безопасности формирует более устойчивую архитектуру с первой итерации: TOTP MFA, CSRF-защита, блокировка аккаунта и строгие проверки входных данных были включены изначально. AI-версия потребовала дополнительного аудита и ручной правки по 10 пунктам. Вместе с тем, после исправления обе версии демонстрируют сопоставимый уровень защищённости.</w:t>
+      </w:r>
+    </w:p>
+    <w:p>
+      <w:pPr>
+        <w:spacing w:after="120"/>
+      </w:pPr>
+      <w:r>
+        <w:rPr>
+          <w:rFonts w:ascii="Times New Roman" w:hAnsi="Times New Roman"/>
+        </w:rPr>
+        <w:t>Ключевой вывод: AI-инструменты являются эффективным средством ускорения разработки, но не заменяют знания в области безопасной разработки программного обеспечения. Оптимальная стратегия — использование AI для генерации шаблонного кода в сочетании с обязательным security review, следованием принципам Secure SDLC и регулярным применением методологии OWASP Top 10. Разработчик, осведомлённый о типовых AI-паттернах уязвимостей, способен значительно снизить риски при AI-ассистированной разработке.</w:t>
+      </w:r>
+    </w:p>
+    <w:p>
+      <w:pPr>
+        <w:spacing w:after="120"/>
+      </w:pPr>
+      <w:r>
+        <w:rPr>
+          <w:rFonts w:ascii="Times New Roman" w:hAnsi="Times New Roman"/>
+        </w:rPr>
+        <w:t>Оба MVP размещены в репозитории. Задание подтверждает, что Secure SDLC остаётся обязательным процессом вне зависимости от применяемых инструментов разработки, а AI-ассистированная разработка требует особого внимания к этапам анализа требований безопасности и code review.</w:t>
       </w:r>
     </w:p>
     <w:sectPr>

</xml_diff>